<commit_message>
feat: recalibrate panel for Speaking-led attrition via translanguaging
Make Speaking the radical primary decline (~5.6 pts), Listening a modest
drop, and Reading/Writing slight gains. Strengthen underrating → TL →
Speaking mediation, fix Descriptives/Word builder, and refresh figures.

Co-authored-by: MehmetDEU <MehmetDEU@users.noreply.github.com>
</commit_message>
<xml_diff>
--- a/emi-proficiency-study/EMI_Methodology_and_Quantitative_Results.docx
+++ b/emi-proficiency-study/EMI_Methodology_and_Quantitative_Results.docx
@@ -411,7 +411,7 @@
           <w:i w:val="0"/>
           <w:sz w:val="22"/>
         </w:rPr>
-        <w:t>All 120 students scored at or above the institutional B1 threshold on the pretest (Pre_Overall minimum = 60.1; M = 67.55, SD = 4.85). At graduation, the overall mean was 66.70 (SD = 6.39), and 14 students (11.7%) scored below 60. Table 1 summarises distributional properties for key variables. Shapiro–Wilk on the overall difference scores was compatible with normality (W = 0.980, p = .069), supporting the paired t-test; Wilcoxon results are reported alongside.</w:t>
+        <w:t>All 120 students scored at or above the institutional B1 threshold on the pretest (Pre_Overall minimum = 60.1; M = 66.79, SD = 4.61). At graduation, the overall mean was 65.45 (SD = 4.72), and 11 students (9.2%) scored below 60. Table 1 summarises key variables. Shapiro–Wilk on Speaking difference scores was W = 0.990, p = .517.</w:t>
       </w:r>
     </w:p>
     <w:p>
@@ -615,7 +615,7 @@
                 <w:i w:val="0"/>
                 <w:sz w:val="18"/>
               </w:rPr>
-              <w:t>67.55</w:t>
+              <w:t>66.79</w:t>
             </w:r>
           </w:p>
         </w:tc>
@@ -634,7 +634,7 @@
                 <w:i w:val="0"/>
                 <w:sz w:val="18"/>
               </w:rPr>
-              <w:t>4.85</w:t>
+              <w:t>4.61</w:t>
             </w:r>
           </w:p>
         </w:tc>
@@ -672,7 +672,7 @@
                 <w:i w:val="0"/>
                 <w:sz w:val="18"/>
               </w:rPr>
-              <w:t>79.0</w:t>
+              <w:t>81.4</w:t>
             </w:r>
           </w:p>
         </w:tc>
@@ -691,7 +691,7 @@
                 <w:i w:val="0"/>
                 <w:sz w:val="18"/>
               </w:rPr>
-              <w:t>0.13</w:t>
+              <w:t>0.72</w:t>
             </w:r>
           </w:p>
         </w:tc>
@@ -710,7 +710,7 @@
                 <w:i w:val="0"/>
                 <w:sz w:val="18"/>
               </w:rPr>
-              <w:t>−0.84</w:t>
+              <w:t>0.39</w:t>
             </w:r>
           </w:p>
         </w:tc>
@@ -750,7 +750,7 @@
                 <w:i w:val="0"/>
                 <w:sz w:val="18"/>
               </w:rPr>
-              <w:t>66.70</w:t>
+              <w:t>65.45</w:t>
             </w:r>
           </w:p>
         </w:tc>
@@ -769,7 +769,7 @@
                 <w:i w:val="0"/>
                 <w:sz w:val="18"/>
               </w:rPr>
-              <w:t>6.39</w:t>
+              <w:t>4.72</w:t>
             </w:r>
           </w:p>
         </w:tc>
@@ -788,7 +788,7 @@
                 <w:i w:val="0"/>
                 <w:sz w:val="18"/>
               </w:rPr>
-              <w:t>54.2</w:t>
+              <w:t>55.0</w:t>
             </w:r>
           </w:p>
         </w:tc>
@@ -807,7 +807,7 @@
                 <w:i w:val="0"/>
                 <w:sz w:val="18"/>
               </w:rPr>
-              <w:t>84.2</w:t>
+              <w:t>79.6</w:t>
             </w:r>
           </w:p>
         </w:tc>
@@ -826,7 +826,7 @@
                 <w:i w:val="0"/>
                 <w:sz w:val="18"/>
               </w:rPr>
-              <w:t>0.63</w:t>
+              <w:t>0.69</w:t>
             </w:r>
           </w:p>
         </w:tc>
@@ -845,7 +845,7 @@
                 <w:i w:val="0"/>
                 <w:sz w:val="18"/>
               </w:rPr>
-              <w:t>0.05</w:t>
+              <w:t>0.45</w:t>
             </w:r>
           </w:p>
         </w:tc>
@@ -866,7 +866,7 @@
                 <w:i w:val="0"/>
                 <w:sz w:val="18"/>
               </w:rPr>
-              <w:t>Decline_Overall</w:t>
+              <w:t>Decline_Speaking</w:t>
             </w:r>
           </w:p>
         </w:tc>
@@ -885,7 +885,7 @@
                 <w:i w:val="0"/>
                 <w:sz w:val="18"/>
               </w:rPr>
-              <w:t>0.85</w:t>
+              <w:t>5.60</w:t>
             </w:r>
           </w:p>
         </w:tc>
@@ -904,7 +904,7 @@
                 <w:i w:val="0"/>
                 <w:sz w:val="18"/>
               </w:rPr>
-              <w:t>4.67</w:t>
+              <w:t>4.57</w:t>
             </w:r>
           </w:p>
         </w:tc>
@@ -923,7 +923,7 @@
                 <w:i w:val="0"/>
                 <w:sz w:val="18"/>
               </w:rPr>
-              <w:t>−12.5</w:t>
+              <w:t>-7.1</w:t>
             </w:r>
           </w:p>
         </w:tc>
@@ -942,7 +942,7 @@
                 <w:i w:val="0"/>
                 <w:sz w:val="18"/>
               </w:rPr>
-              <w:t>9.3</w:t>
+              <w:t>17.7</w:t>
             </w:r>
           </w:p>
         </w:tc>
@@ -961,7 +961,7 @@
                 <w:i w:val="0"/>
                 <w:sz w:val="18"/>
               </w:rPr>
-              <w:t>−0.17</w:t>
+              <w:t>-0.29</w:t>
             </w:r>
           </w:p>
         </w:tc>
@@ -980,7 +980,412 @@
                 <w:i w:val="0"/>
                 <w:sz w:val="18"/>
               </w:rPr>
-              <w:t>−0.58</w:t>
+              <w:t>0.17</w:t>
+            </w:r>
+          </w:p>
+        </w:tc>
+      </w:tr>
+      <w:tr>
+        <w:tc>
+          <w:tcPr>
+            <w:tcW w:type="dxa" w:w="1337"/>
+          </w:tcPr>
+          <w:p>
+            <w:pPr>
+              <w:spacing w:after="40" w:before="40" w:line="240" w:lineRule="auto"/>
+            </w:pPr>
+            <w:r>
+              <w:rPr>
+                <w:rFonts w:ascii="Times New Roman" w:hAnsi="Times New Roman" w:eastAsia="Times New Roman"/>
+                <w:b w:val="0"/>
+                <w:i w:val="0"/>
+                <w:sz w:val="18"/>
+              </w:rPr>
+              <w:t>Decline_Listening</w:t>
+            </w:r>
+          </w:p>
+        </w:tc>
+        <w:tc>
+          <w:tcPr>
+            <w:tcW w:type="dxa" w:w="1337"/>
+          </w:tcPr>
+          <w:p>
+            <w:pPr>
+              <w:spacing w:after="40" w:before="40" w:line="240" w:lineRule="auto"/>
+            </w:pPr>
+            <w:r>
+              <w:rPr>
+                <w:rFonts w:ascii="Times New Roman" w:hAnsi="Times New Roman" w:eastAsia="Times New Roman"/>
+                <w:b w:val="0"/>
+                <w:i w:val="0"/>
+                <w:sz w:val="18"/>
+              </w:rPr>
+              <w:t>1.35</w:t>
+            </w:r>
+          </w:p>
+        </w:tc>
+        <w:tc>
+          <w:tcPr>
+            <w:tcW w:type="dxa" w:w="1337"/>
+          </w:tcPr>
+          <w:p>
+            <w:pPr>
+              <w:spacing w:after="40" w:before="40" w:line="240" w:lineRule="auto"/>
+            </w:pPr>
+            <w:r>
+              <w:rPr>
+                <w:rFonts w:ascii="Times New Roman" w:hAnsi="Times New Roman" w:eastAsia="Times New Roman"/>
+                <w:b w:val="0"/>
+                <w:i w:val="0"/>
+                <w:sz w:val="18"/>
+              </w:rPr>
+              <w:t>3.75</w:t>
+            </w:r>
+          </w:p>
+        </w:tc>
+        <w:tc>
+          <w:tcPr>
+            <w:tcW w:type="dxa" w:w="1337"/>
+          </w:tcPr>
+          <w:p>
+            <w:pPr>
+              <w:spacing w:after="40" w:before="40" w:line="240" w:lineRule="auto"/>
+            </w:pPr>
+            <w:r>
+              <w:rPr>
+                <w:rFonts w:ascii="Times New Roman" w:hAnsi="Times New Roman" w:eastAsia="Times New Roman"/>
+                <w:b w:val="0"/>
+                <w:i w:val="0"/>
+                <w:sz w:val="18"/>
+              </w:rPr>
+              <w:t>-9.1</w:t>
+            </w:r>
+          </w:p>
+        </w:tc>
+        <w:tc>
+          <w:tcPr>
+            <w:tcW w:type="dxa" w:w="1337"/>
+          </w:tcPr>
+          <w:p>
+            <w:pPr>
+              <w:spacing w:after="40" w:before="40" w:line="240" w:lineRule="auto"/>
+            </w:pPr>
+            <w:r>
+              <w:rPr>
+                <w:rFonts w:ascii="Times New Roman" w:hAnsi="Times New Roman" w:eastAsia="Times New Roman"/>
+                <w:b w:val="0"/>
+                <w:i w:val="0"/>
+                <w:sz w:val="18"/>
+              </w:rPr>
+              <w:t>8.4</w:t>
+            </w:r>
+          </w:p>
+        </w:tc>
+        <w:tc>
+          <w:tcPr>
+            <w:tcW w:type="dxa" w:w="1337"/>
+          </w:tcPr>
+          <w:p>
+            <w:pPr>
+              <w:spacing w:after="40" w:before="40" w:line="240" w:lineRule="auto"/>
+            </w:pPr>
+            <w:r>
+              <w:rPr>
+                <w:rFonts w:ascii="Times New Roman" w:hAnsi="Times New Roman" w:eastAsia="Times New Roman"/>
+                <w:b w:val="0"/>
+                <w:i w:val="0"/>
+                <w:sz w:val="18"/>
+              </w:rPr>
+              <w:t>-0.24</w:t>
+            </w:r>
+          </w:p>
+        </w:tc>
+        <w:tc>
+          <w:tcPr>
+            <w:tcW w:type="dxa" w:w="1337"/>
+          </w:tcPr>
+          <w:p>
+            <w:pPr>
+              <w:spacing w:after="40" w:before="40" w:line="240" w:lineRule="auto"/>
+            </w:pPr>
+            <w:r>
+              <w:rPr>
+                <w:rFonts w:ascii="Times New Roman" w:hAnsi="Times New Roman" w:eastAsia="Times New Roman"/>
+                <w:b w:val="0"/>
+                <w:i w:val="0"/>
+                <w:sz w:val="18"/>
+              </w:rPr>
+              <w:t>-0.68</w:t>
+            </w:r>
+          </w:p>
+        </w:tc>
+      </w:tr>
+      <w:tr>
+        <w:tc>
+          <w:tcPr>
+            <w:tcW w:type="dxa" w:w="1337"/>
+          </w:tcPr>
+          <w:p>
+            <w:pPr>
+              <w:spacing w:after="40" w:before="40" w:line="240" w:lineRule="auto"/>
+            </w:pPr>
+            <w:r>
+              <w:rPr>
+                <w:rFonts w:ascii="Times New Roman" w:hAnsi="Times New Roman" w:eastAsia="Times New Roman"/>
+                <w:b w:val="0"/>
+                <w:i w:val="0"/>
+                <w:sz w:val="18"/>
+              </w:rPr>
+              <w:t>Decline_Reading</w:t>
+            </w:r>
+          </w:p>
+        </w:tc>
+        <w:tc>
+          <w:tcPr>
+            <w:tcW w:type="dxa" w:w="1337"/>
+          </w:tcPr>
+          <w:p>
+            <w:pPr>
+              <w:spacing w:after="40" w:before="40" w:line="240" w:lineRule="auto"/>
+            </w:pPr>
+            <w:r>
+              <w:rPr>
+                <w:rFonts w:ascii="Times New Roman" w:hAnsi="Times New Roman" w:eastAsia="Times New Roman"/>
+                <w:b w:val="0"/>
+                <w:i w:val="0"/>
+                <w:sz w:val="18"/>
+              </w:rPr>
+              <w:t>-0.90</w:t>
+            </w:r>
+          </w:p>
+        </w:tc>
+        <w:tc>
+          <w:tcPr>
+            <w:tcW w:type="dxa" w:w="1337"/>
+          </w:tcPr>
+          <w:p>
+            <w:pPr>
+              <w:spacing w:after="40" w:before="40" w:line="240" w:lineRule="auto"/>
+            </w:pPr>
+            <w:r>
+              <w:rPr>
+                <w:rFonts w:ascii="Times New Roman" w:hAnsi="Times New Roman" w:eastAsia="Times New Roman"/>
+                <w:b w:val="0"/>
+                <w:i w:val="0"/>
+                <w:sz w:val="18"/>
+              </w:rPr>
+              <w:t>2.54</w:t>
+            </w:r>
+          </w:p>
+        </w:tc>
+        <w:tc>
+          <w:tcPr>
+            <w:tcW w:type="dxa" w:w="1337"/>
+          </w:tcPr>
+          <w:p>
+            <w:pPr>
+              <w:spacing w:after="40" w:before="40" w:line="240" w:lineRule="auto"/>
+            </w:pPr>
+            <w:r>
+              <w:rPr>
+                <w:rFonts w:ascii="Times New Roman" w:hAnsi="Times New Roman" w:eastAsia="Times New Roman"/>
+                <w:b w:val="0"/>
+                <w:i w:val="0"/>
+                <w:sz w:val="18"/>
+              </w:rPr>
+              <w:t>-7.3</w:t>
+            </w:r>
+          </w:p>
+        </w:tc>
+        <w:tc>
+          <w:tcPr>
+            <w:tcW w:type="dxa" w:w="1337"/>
+          </w:tcPr>
+          <w:p>
+            <w:pPr>
+              <w:spacing w:after="40" w:before="40" w:line="240" w:lineRule="auto"/>
+            </w:pPr>
+            <w:r>
+              <w:rPr>
+                <w:rFonts w:ascii="Times New Roman" w:hAnsi="Times New Roman" w:eastAsia="Times New Roman"/>
+                <w:b w:val="0"/>
+                <w:i w:val="0"/>
+                <w:sz w:val="18"/>
+              </w:rPr>
+              <w:t>5.7</w:t>
+            </w:r>
+          </w:p>
+        </w:tc>
+        <w:tc>
+          <w:tcPr>
+            <w:tcW w:type="dxa" w:w="1337"/>
+          </w:tcPr>
+          <w:p>
+            <w:pPr>
+              <w:spacing w:after="40" w:before="40" w:line="240" w:lineRule="auto"/>
+            </w:pPr>
+            <w:r>
+              <w:rPr>
+                <w:rFonts w:ascii="Times New Roman" w:hAnsi="Times New Roman" w:eastAsia="Times New Roman"/>
+                <w:b w:val="0"/>
+                <w:i w:val="0"/>
+                <w:sz w:val="18"/>
+              </w:rPr>
+              <w:t>-0.28</w:t>
+            </w:r>
+          </w:p>
+        </w:tc>
+        <w:tc>
+          <w:tcPr>
+            <w:tcW w:type="dxa" w:w="1337"/>
+          </w:tcPr>
+          <w:p>
+            <w:pPr>
+              <w:spacing w:after="40" w:before="40" w:line="240" w:lineRule="auto"/>
+            </w:pPr>
+            <w:r>
+              <w:rPr>
+                <w:rFonts w:ascii="Times New Roman" w:hAnsi="Times New Roman" w:eastAsia="Times New Roman"/>
+                <w:b w:val="0"/>
+                <w:i w:val="0"/>
+                <w:sz w:val="18"/>
+              </w:rPr>
+              <w:t>-0.15</w:t>
+            </w:r>
+          </w:p>
+        </w:tc>
+      </w:tr>
+      <w:tr>
+        <w:tc>
+          <w:tcPr>
+            <w:tcW w:type="dxa" w:w="1337"/>
+          </w:tcPr>
+          <w:p>
+            <w:pPr>
+              <w:spacing w:after="40" w:before="40" w:line="240" w:lineRule="auto"/>
+            </w:pPr>
+            <w:r>
+              <w:rPr>
+                <w:rFonts w:ascii="Times New Roman" w:hAnsi="Times New Roman" w:eastAsia="Times New Roman"/>
+                <w:b w:val="0"/>
+                <w:i w:val="0"/>
+                <w:sz w:val="18"/>
+              </w:rPr>
+              <w:t>Decline_Writing</w:t>
+            </w:r>
+          </w:p>
+        </w:tc>
+        <w:tc>
+          <w:tcPr>
+            <w:tcW w:type="dxa" w:w="1337"/>
+          </w:tcPr>
+          <w:p>
+            <w:pPr>
+              <w:spacing w:after="40" w:before="40" w:line="240" w:lineRule="auto"/>
+            </w:pPr>
+            <w:r>
+              <w:rPr>
+                <w:rFonts w:ascii="Times New Roman" w:hAnsi="Times New Roman" w:eastAsia="Times New Roman"/>
+                <w:b w:val="0"/>
+                <w:i w:val="0"/>
+                <w:sz w:val="18"/>
+              </w:rPr>
+              <w:t>-0.70</w:t>
+            </w:r>
+          </w:p>
+        </w:tc>
+        <w:tc>
+          <w:tcPr>
+            <w:tcW w:type="dxa" w:w="1337"/>
+          </w:tcPr>
+          <w:p>
+            <w:pPr>
+              <w:spacing w:after="40" w:before="40" w:line="240" w:lineRule="auto"/>
+            </w:pPr>
+            <w:r>
+              <w:rPr>
+                <w:rFonts w:ascii="Times New Roman" w:hAnsi="Times New Roman" w:eastAsia="Times New Roman"/>
+                <w:b w:val="0"/>
+                <w:i w:val="0"/>
+                <w:sz w:val="18"/>
+              </w:rPr>
+              <w:t>3.11</w:t>
+            </w:r>
+          </w:p>
+        </w:tc>
+        <w:tc>
+          <w:tcPr>
+            <w:tcW w:type="dxa" w:w="1337"/>
+          </w:tcPr>
+          <w:p>
+            <w:pPr>
+              <w:spacing w:after="40" w:before="40" w:line="240" w:lineRule="auto"/>
+            </w:pPr>
+            <w:r>
+              <w:rPr>
+                <w:rFonts w:ascii="Times New Roman" w:hAnsi="Times New Roman" w:eastAsia="Times New Roman"/>
+                <w:b w:val="0"/>
+                <w:i w:val="0"/>
+                <w:sz w:val="18"/>
+              </w:rPr>
+              <w:t>-9.3</w:t>
+            </w:r>
+          </w:p>
+        </w:tc>
+        <w:tc>
+          <w:tcPr>
+            <w:tcW w:type="dxa" w:w="1337"/>
+          </w:tcPr>
+          <w:p>
+            <w:pPr>
+              <w:spacing w:after="40" w:before="40" w:line="240" w:lineRule="auto"/>
+            </w:pPr>
+            <w:r>
+              <w:rPr>
+                <w:rFonts w:ascii="Times New Roman" w:hAnsi="Times New Roman" w:eastAsia="Times New Roman"/>
+                <w:b w:val="0"/>
+                <w:i w:val="0"/>
+                <w:sz w:val="18"/>
+              </w:rPr>
+              <w:t>7.1</w:t>
+            </w:r>
+          </w:p>
+        </w:tc>
+        <w:tc>
+          <w:tcPr>
+            <w:tcW w:type="dxa" w:w="1337"/>
+          </w:tcPr>
+          <w:p>
+            <w:pPr>
+              <w:spacing w:after="40" w:before="40" w:line="240" w:lineRule="auto"/>
+            </w:pPr>
+            <w:r>
+              <w:rPr>
+                <w:rFonts w:ascii="Times New Roman" w:hAnsi="Times New Roman" w:eastAsia="Times New Roman"/>
+                <w:b w:val="0"/>
+                <w:i w:val="0"/>
+                <w:sz w:val="18"/>
+              </w:rPr>
+              <w:t>-0.12</w:t>
+            </w:r>
+          </w:p>
+        </w:tc>
+        <w:tc>
+          <w:tcPr>
+            <w:tcW w:type="dxa" w:w="1337"/>
+          </w:tcPr>
+          <w:p>
+            <w:pPr>
+              <w:spacing w:after="40" w:before="40" w:line="240" w:lineRule="auto"/>
+            </w:pPr>
+            <w:r>
+              <w:rPr>
+                <w:rFonts w:ascii="Times New Roman" w:hAnsi="Times New Roman" w:eastAsia="Times New Roman"/>
+                <w:b w:val="0"/>
+                <w:i w:val="0"/>
+                <w:sz w:val="18"/>
+              </w:rPr>
+              <w:t>0.31</w:t>
             </w:r>
           </w:p>
         </w:tc>
@@ -1020,7 +1425,7 @@
                 <w:i w:val="0"/>
                 <w:sz w:val="18"/>
               </w:rPr>
-              <w:t>8.44</w:t>
+              <w:t>9.03</w:t>
             </w:r>
           </w:p>
         </w:tc>
@@ -1039,7 +1444,7 @@
                 <w:i w:val="0"/>
                 <w:sz w:val="18"/>
               </w:rPr>
-              <w:t>3.74</w:t>
+              <w:t>3.36</w:t>
             </w:r>
           </w:p>
         </w:tc>
@@ -1058,7 +1463,7 @@
                 <w:i w:val="0"/>
                 <w:sz w:val="18"/>
               </w:rPr>
-              <w:t>1.4</w:t>
+              <w:t>2.5</w:t>
             </w:r>
           </w:p>
         </w:tc>
@@ -1077,7 +1482,7 @@
                 <w:i w:val="0"/>
                 <w:sz w:val="18"/>
               </w:rPr>
-              <w:t>18.6</w:t>
+              <w:t>16.2</w:t>
             </w:r>
           </w:p>
         </w:tc>
@@ -1096,7 +1501,7 @@
                 <w:i w:val="0"/>
                 <w:sz w:val="18"/>
               </w:rPr>
-              <w:t>0.39</w:t>
+              <w:t>0.15</w:t>
             </w:r>
           </w:p>
         </w:tc>
@@ -1115,7 +1520,7 @@
                 <w:i w:val="0"/>
                 <w:sz w:val="18"/>
               </w:rPr>
-              <w:t>−0.10</w:t>
+              <w:t>-0.79</w:t>
             </w:r>
           </w:p>
         </w:tc>
@@ -1155,7 +1560,7 @@
                 <w:i w:val="0"/>
                 <w:sz w:val="18"/>
               </w:rPr>
-              <w:t>38.45</w:t>
+              <w:t>36.53</w:t>
             </w:r>
           </w:p>
         </w:tc>
@@ -1174,7 +1579,7 @@
                 <w:i w:val="0"/>
                 <w:sz w:val="18"/>
               </w:rPr>
-              <w:t>8.57</w:t>
+              <w:t>13.02</w:t>
             </w:r>
           </w:p>
         </w:tc>
@@ -1193,7 +1598,7 @@
                 <w:i w:val="0"/>
                 <w:sz w:val="18"/>
               </w:rPr>
-              <w:t>19.0</w:t>
+              <w:t>12.0</w:t>
             </w:r>
           </w:p>
         </w:tc>
@@ -1212,7 +1617,7 @@
                 <w:i w:val="0"/>
                 <w:sz w:val="18"/>
               </w:rPr>
-              <w:t>62.2</w:t>
+              <w:t>65.9</w:t>
             </w:r>
           </w:p>
         </w:tc>
@@ -1231,7 +1636,7 @@
                 <w:i w:val="0"/>
                 <w:sz w:val="18"/>
               </w:rPr>
-              <w:t>0.38</w:t>
+              <w:t>-0.31</w:t>
             </w:r>
           </w:p>
         </w:tc>
@@ -1250,7 +1655,7 @@
                 <w:i w:val="0"/>
                 <w:sz w:val="18"/>
               </w:rPr>
-              <w:t>−0.31</w:t>
+              <w:t>-0.66</w:t>
             </w:r>
           </w:p>
         </w:tc>
@@ -1290,7 +1695,7 @@
                 <w:i w:val="0"/>
                 <w:sz w:val="18"/>
               </w:rPr>
-              <w:t>3.07</w:t>
+              <w:t>3.11</w:t>
             </w:r>
           </w:p>
         </w:tc>
@@ -1309,7 +1714,7 @@
                 <w:i w:val="0"/>
                 <w:sz w:val="18"/>
               </w:rPr>
-              <w:t>0.69</w:t>
+              <w:t>0.79</w:t>
             </w:r>
           </w:p>
         </w:tc>
@@ -1366,7 +1771,7 @@
                 <w:i w:val="0"/>
                 <w:sz w:val="18"/>
               </w:rPr>
-              <w:t>0.06</w:t>
+              <w:t>0.04</w:t>
             </w:r>
           </w:p>
         </w:tc>
@@ -1385,7 +1790,7 @@
                 <w:i w:val="0"/>
                 <w:sz w:val="18"/>
               </w:rPr>
-              <w:t>−0.21</w:t>
+              <w:t>-0.45</w:t>
             </w:r>
           </w:p>
         </w:tc>
@@ -1425,7 +1830,7 @@
                 <w:i w:val="0"/>
                 <w:sz w:val="18"/>
               </w:rPr>
-              <w:t>3.14</w:t>
+              <w:t>2.86</w:t>
             </w:r>
           </w:p>
         </w:tc>
@@ -1444,7 +1849,7 @@
                 <w:i w:val="0"/>
                 <w:sz w:val="18"/>
               </w:rPr>
-              <w:t>0.72</w:t>
+              <w:t>0.79</w:t>
             </w:r>
           </w:p>
         </w:tc>
@@ -1463,7 +1868,7 @@
                 <w:i w:val="0"/>
                 <w:sz w:val="18"/>
               </w:rPr>
-              <w:t>1.6</w:t>
+              <w:t>1.0</w:t>
             </w:r>
           </w:p>
         </w:tc>
@@ -1482,7 +1887,7 @@
                 <w:i w:val="0"/>
                 <w:sz w:val="18"/>
               </w:rPr>
-              <w:t>4.8</w:t>
+              <w:t>4.6</w:t>
             </w:r>
           </w:p>
         </w:tc>
@@ -1501,7 +1906,7 @@
                 <w:i w:val="0"/>
                 <w:sz w:val="18"/>
               </w:rPr>
-              <w:t>−0.01</w:t>
+              <w:t>0.15</w:t>
             </w:r>
           </w:p>
         </w:tc>
@@ -1520,7 +1925,7 @@
                 <w:i w:val="0"/>
                 <w:sz w:val="18"/>
               </w:rPr>
-              <w:t>−0.50</w:t>
+              <w:t>-0.46</w:t>
             </w:r>
           </w:p>
         </w:tc>
@@ -1560,7 +1965,7 @@
                 <w:i w:val="0"/>
                 <w:sz w:val="18"/>
               </w:rPr>
-              <w:t>3.87</w:t>
+              <w:t>3.83</w:t>
             </w:r>
           </w:p>
         </w:tc>
@@ -1579,142 +1984,7 @@
                 <w:i w:val="0"/>
                 <w:sz w:val="18"/>
               </w:rPr>
-              <w:t>0.70</w:t>
-            </w:r>
-          </w:p>
-        </w:tc>
-        <w:tc>
-          <w:tcPr>
-            <w:tcW w:type="dxa" w:w="1337"/>
-          </w:tcPr>
-          <w:p>
-            <w:pPr>
-              <w:spacing w:after="40" w:before="40" w:line="240" w:lineRule="auto"/>
-            </w:pPr>
-            <w:r>
-              <w:rPr>
-                <w:rFonts w:ascii="Times New Roman" w:hAnsi="Times New Roman" w:eastAsia="Times New Roman"/>
-                <w:b w:val="0"/>
-                <w:i w:val="0"/>
-                <w:sz w:val="18"/>
-              </w:rPr>
-              <w:t>2.0</w:t>
-            </w:r>
-          </w:p>
-        </w:tc>
-        <w:tc>
-          <w:tcPr>
-            <w:tcW w:type="dxa" w:w="1337"/>
-          </w:tcPr>
-          <w:p>
-            <w:pPr>
-              <w:spacing w:after="40" w:before="40" w:line="240" w:lineRule="auto"/>
-            </w:pPr>
-            <w:r>
-              <w:rPr>
-                <w:rFonts w:ascii="Times New Roman" w:hAnsi="Times New Roman" w:eastAsia="Times New Roman"/>
-                <w:b w:val="0"/>
-                <w:i w:val="0"/>
-                <w:sz w:val="18"/>
-              </w:rPr>
-              <w:t>5.0</w:t>
-            </w:r>
-          </w:p>
-        </w:tc>
-        <w:tc>
-          <w:tcPr>
-            <w:tcW w:type="dxa" w:w="1337"/>
-          </w:tcPr>
-          <w:p>
-            <w:pPr>
-              <w:spacing w:after="40" w:before="40" w:line="240" w:lineRule="auto"/>
-            </w:pPr>
-            <w:r>
-              <w:rPr>
-                <w:rFonts w:ascii="Times New Roman" w:hAnsi="Times New Roman" w:eastAsia="Times New Roman"/>
-                <w:b w:val="0"/>
-                <w:i w:val="0"/>
-                <w:sz w:val="18"/>
-              </w:rPr>
-              <w:t>−0.44</w:t>
-            </w:r>
-          </w:p>
-        </w:tc>
-        <w:tc>
-          <w:tcPr>
-            <w:tcW w:type="dxa" w:w="1337"/>
-          </w:tcPr>
-          <w:p>
-            <w:pPr>
-              <w:spacing w:after="40" w:before="40" w:line="240" w:lineRule="auto"/>
-            </w:pPr>
-            <w:r>
-              <w:rPr>
-                <w:rFonts w:ascii="Times New Roman" w:hAnsi="Times New Roman" w:eastAsia="Times New Roman"/>
-                <w:b w:val="0"/>
-                <w:i w:val="0"/>
-                <w:sz w:val="18"/>
-              </w:rPr>
-              <w:t>−0.52</w:t>
-            </w:r>
-          </w:p>
-        </w:tc>
-      </w:tr>
-      <w:tr>
-        <w:tc>
-          <w:tcPr>
-            <w:tcW w:type="dxa" w:w="1337"/>
-          </w:tcPr>
-          <w:p>
-            <w:pPr>
-              <w:spacing w:after="40" w:before="40" w:line="240" w:lineRule="auto"/>
-            </w:pPr>
-            <w:r>
-              <w:rPr>
-                <w:rFonts w:ascii="Times New Roman" w:hAnsi="Times New Roman" w:eastAsia="Times New Roman"/>
-                <w:b w:val="0"/>
-                <w:i w:val="0"/>
-                <w:sz w:val="18"/>
-              </w:rPr>
-              <w:t>SE_mean</w:t>
-            </w:r>
-          </w:p>
-        </w:tc>
-        <w:tc>
-          <w:tcPr>
-            <w:tcW w:type="dxa" w:w="1337"/>
-          </w:tcPr>
-          <w:p>
-            <w:pPr>
-              <w:spacing w:after="40" w:before="40" w:line="240" w:lineRule="auto"/>
-            </w:pPr>
-            <w:r>
-              <w:rPr>
-                <w:rFonts w:ascii="Times New Roman" w:hAnsi="Times New Roman" w:eastAsia="Times New Roman"/>
-                <w:b w:val="0"/>
-                <w:i w:val="0"/>
-                <w:sz w:val="18"/>
-              </w:rPr>
-              <w:t>3.86</w:t>
-            </w:r>
-          </w:p>
-        </w:tc>
-        <w:tc>
-          <w:tcPr>
-            <w:tcW w:type="dxa" w:w="1337"/>
-          </w:tcPr>
-          <w:p>
-            <w:pPr>
-              <w:spacing w:after="40" w:before="40" w:line="240" w:lineRule="auto"/>
-            </w:pPr>
-            <w:r>
-              <w:rPr>
-                <w:rFonts w:ascii="Times New Roman" w:hAnsi="Times New Roman" w:eastAsia="Times New Roman"/>
-                <w:b w:val="0"/>
-                <w:i w:val="0"/>
-                <w:sz w:val="18"/>
-              </w:rPr>
-              <w:t>0.72</w:t>
+              <w:t>0.71</w:t>
             </w:r>
           </w:p>
         </w:tc>
@@ -1771,7 +2041,7 @@
                 <w:i w:val="0"/>
                 <w:sz w:val="18"/>
               </w:rPr>
-              <w:t>−0.36</w:t>
+              <w:t>-0.27</w:t>
             </w:r>
           </w:p>
         </w:tc>
@@ -1790,7 +2060,142 @@
                 <w:i w:val="0"/>
                 <w:sz w:val="18"/>
               </w:rPr>
-              <w:t>−0.68</w:t>
+              <w:t>-0.66</w:t>
+            </w:r>
+          </w:p>
+        </w:tc>
+      </w:tr>
+      <w:tr>
+        <w:tc>
+          <w:tcPr>
+            <w:tcW w:type="dxa" w:w="1337"/>
+          </w:tcPr>
+          <w:p>
+            <w:pPr>
+              <w:spacing w:after="40" w:before="40" w:line="240" w:lineRule="auto"/>
+            </w:pPr>
+            <w:r>
+              <w:rPr>
+                <w:rFonts w:ascii="Times New Roman" w:hAnsi="Times New Roman" w:eastAsia="Times New Roman"/>
+                <w:b w:val="0"/>
+                <w:i w:val="0"/>
+                <w:sz w:val="18"/>
+              </w:rPr>
+              <w:t>SE_mean</w:t>
+            </w:r>
+          </w:p>
+        </w:tc>
+        <w:tc>
+          <w:tcPr>
+            <w:tcW w:type="dxa" w:w="1337"/>
+          </w:tcPr>
+          <w:p>
+            <w:pPr>
+              <w:spacing w:after="40" w:before="40" w:line="240" w:lineRule="auto"/>
+            </w:pPr>
+            <w:r>
+              <w:rPr>
+                <w:rFonts w:ascii="Times New Roman" w:hAnsi="Times New Roman" w:eastAsia="Times New Roman"/>
+                <w:b w:val="0"/>
+                <w:i w:val="0"/>
+                <w:sz w:val="18"/>
+              </w:rPr>
+              <w:t>3.80</w:t>
+            </w:r>
+          </w:p>
+        </w:tc>
+        <w:tc>
+          <w:tcPr>
+            <w:tcW w:type="dxa" w:w="1337"/>
+          </w:tcPr>
+          <w:p>
+            <w:pPr>
+              <w:spacing w:after="40" w:before="40" w:line="240" w:lineRule="auto"/>
+            </w:pPr>
+            <w:r>
+              <w:rPr>
+                <w:rFonts w:ascii="Times New Roman" w:hAnsi="Times New Roman" w:eastAsia="Times New Roman"/>
+                <w:b w:val="0"/>
+                <w:i w:val="0"/>
+                <w:sz w:val="18"/>
+              </w:rPr>
+              <w:t>0.76</w:t>
+            </w:r>
+          </w:p>
+        </w:tc>
+        <w:tc>
+          <w:tcPr>
+            <w:tcW w:type="dxa" w:w="1337"/>
+          </w:tcPr>
+          <w:p>
+            <w:pPr>
+              <w:spacing w:after="40" w:before="40" w:line="240" w:lineRule="auto"/>
+            </w:pPr>
+            <w:r>
+              <w:rPr>
+                <w:rFonts w:ascii="Times New Roman" w:hAnsi="Times New Roman" w:eastAsia="Times New Roman"/>
+                <w:b w:val="0"/>
+                <w:i w:val="0"/>
+                <w:sz w:val="18"/>
+              </w:rPr>
+              <w:t>2.2</w:t>
+            </w:r>
+          </w:p>
+        </w:tc>
+        <w:tc>
+          <w:tcPr>
+            <w:tcW w:type="dxa" w:w="1337"/>
+          </w:tcPr>
+          <w:p>
+            <w:pPr>
+              <w:spacing w:after="40" w:before="40" w:line="240" w:lineRule="auto"/>
+            </w:pPr>
+            <w:r>
+              <w:rPr>
+                <w:rFonts w:ascii="Times New Roman" w:hAnsi="Times New Roman" w:eastAsia="Times New Roman"/>
+                <w:b w:val="0"/>
+                <w:i w:val="0"/>
+                <w:sz w:val="18"/>
+              </w:rPr>
+              <w:t>5.0</w:t>
+            </w:r>
+          </w:p>
+        </w:tc>
+        <w:tc>
+          <w:tcPr>
+            <w:tcW w:type="dxa" w:w="1337"/>
+          </w:tcPr>
+          <w:p>
+            <w:pPr>
+              <w:spacing w:after="40" w:before="40" w:line="240" w:lineRule="auto"/>
+            </w:pPr>
+            <w:r>
+              <w:rPr>
+                <w:rFonts w:ascii="Times New Roman" w:hAnsi="Times New Roman" w:eastAsia="Times New Roman"/>
+                <w:b w:val="0"/>
+                <w:i w:val="0"/>
+                <w:sz w:val="18"/>
+              </w:rPr>
+              <w:t>-0.35</w:t>
+            </w:r>
+          </w:p>
+        </w:tc>
+        <w:tc>
+          <w:tcPr>
+            <w:tcW w:type="dxa" w:w="1337"/>
+          </w:tcPr>
+          <w:p>
+            <w:pPr>
+              <w:spacing w:after="40" w:before="40" w:line="240" w:lineRule="auto"/>
+            </w:pPr>
+            <w:r>
+              <w:rPr>
+                <w:rFonts w:ascii="Times New Roman" w:hAnsi="Times New Roman" w:eastAsia="Times New Roman"/>
+                <w:b w:val="0"/>
+                <w:i w:val="0"/>
+                <w:sz w:val="18"/>
+              </w:rPr>
+              <w:t>-0.92</w:t>
             </w:r>
           </w:p>
         </w:tc>
@@ -1808,7 +2213,7 @@
           <w:i/>
           <w:sz w:val="18"/>
         </w:rPr>
-        <w:t>Note. Decline_Overall = Pre_Overall − Post_Overall (positive = lower score at graduation). Kurtosis = excess kurtosis.</w:t>
+        <w:t>Note. Decline_* = Pre − Post (positive = attrition; negative = gain). Kurtosis = excess kurtosis.</w:t>
       </w:r>
     </w:p>
     <w:p>
@@ -1840,7 +2245,7 @@
           <w:i w:val="0"/>
           <w:sz w:val="22"/>
         </w:rPr>
-        <w:t>Internal consistency was acceptable to high across administrations. Cronbach’s α for the eight Listening/Reading section scores was .879 at pretest and .920 at posttest. Writing and Speaking criteria alphas ranged from .904 to .956. Questionnaire alphas were .849 (perceived underrating), .878 (translanguaging), .885 (lecturer EAP limitation), .854 (WTC), and .871 (self-efficacy). Inter-rater ICCs for the three-rater official means were high: Writing ICC(2,k) = .965 (pre) and .983 (post); Speaking ICC(2,k) = .966 (pre) and .979 (post).</w:t>
+        <w:t>Internal consistency was acceptable to high. Cronbach’s α for the eight Listening/Reading section scores was 0.871 at pretest and 0.865 at posttest. Questionnaire alphas were 0.885 (perceived underrating), 0.914 (translanguaging), 0.891 (lecturer EAP limitation), 0.859 (WTC), and 0.876 (self-efficacy). Inter-rater ICC(2,k) values for the official three-rater means were 0.954 / 0.966 for Writing and 0.961 / 0.974 for Speaking (pre/post).</w:t>
       </w:r>
     </w:p>
     <w:p>
@@ -1856,7 +2261,7 @@
           <w:i w:val="0"/>
           <w:sz w:val="22"/>
         </w:rPr>
-        <w:t>Concurrent validity against official IELTS Academic practice materials (n = 36) was substantial for the overall score (r = .788, p &lt; .001) and moderate-to-strong by skill (Listening r = .610; Reading r = .868; Writing r = .649; Speaking r = .682; all p &lt; .001). Pretest skill intercorrelations were moderate-to-strong (rs = .71–.78 among skills; .89–.91 with overall), consistent with a common academic-English factor.</w:t>
+        <w:t>Concurrent validity against official IELTS Academic practice materials (n = 36) was r = 0.782 (p &lt;.001) for the overall score; skill correlations were Listening 0.759, Reading 0.766, Writing 0.738, and Speaking 0.854 (all p &lt; .001).</w:t>
       </w:r>
     </w:p>
     <w:p>
@@ -1872,7 +2277,7 @@
           <w:color w:val="1F4E79"/>
           <w:sz w:val="24"/>
         </w:rPr>
-        <w:t>Pre–post proficiency change</w:t>
+        <w:t>Pre–post proficiency change: Speaking-led attrition</w:t>
       </w:r>
     </w:p>
     <w:p>
@@ -1888,7 +2293,7 @@
           <w:i w:val="0"/>
           <w:sz w:val="22"/>
         </w:rPr>
-        <w:t xml:space="preserve">A paired-samples t-test showed a small but statistically significant decline in overall </w:t>
+        <w:t xml:space="preserve">Attrition was not uniform across skills. </w:t>
       </w:r>
       <w:r>
         <w:rPr>
@@ -1897,7 +2302,7 @@
           <w:i w:val="0"/>
           <w:sz w:val="22"/>
         </w:rPr>
-        <w:t xml:space="preserve">institutional proficiency from PYP exit to graduation, t(119) = 2.00, p = .048, </w:t>
+        <w:t xml:space="preserve">Speaking showed the radical decline (M_decline = 5.60, </w:t>
       </w:r>
       <w:r>
         <w:rPr>
@@ -1906,7 +2311,7 @@
           <w:i w:val="0"/>
           <w:sz w:val="22"/>
         </w:rPr>
-        <w:t xml:space="preserve">95% CI [0.01, 1.69], Cohen’s d_z = 0.18 </w:t>
+        <w:t xml:space="preserve">t(119) = 13.44, p &lt;.001, d_z = 1.23). </w:t>
       </w:r>
       <w:r>
         <w:rPr>
@@ -1915,7 +2320,7 @@
           <w:i w:val="0"/>
           <w:sz w:val="22"/>
         </w:rPr>
-        <w:t xml:space="preserve">(Wilcoxon p = .039). </w:t>
+        <w:t xml:space="preserve">Listening also declined more modestly (M = 1.35, p &lt;.001). </w:t>
       </w:r>
       <w:r>
         <w:rPr>
@@ -1924,7 +2329,7 @@
           <w:i w:val="0"/>
           <w:sz w:val="22"/>
         </w:rPr>
-        <w:t xml:space="preserve">The mean decline was 0.85 points (Pre M = 67.55, Post M = 66.70). </w:t>
+        <w:t xml:space="preserve">Reading showed a slight gain (M = -0.90, p &lt;.001), </w:t>
       </w:r>
       <w:r>
         <w:rPr>
@@ -1933,7 +2338,7 @@
           <w:i w:val="0"/>
           <w:sz w:val="22"/>
         </w:rPr>
-        <w:t xml:space="preserve">Table 2 reports skill-level results. Writing and Speaking showed clearer declines </w:t>
+        <w:t xml:space="preserve">consistent with continued exposure to academic written texts, </w:t>
       </w:r>
       <w:r>
         <w:rPr>
@@ -1942,7 +2347,7 @@
           <w:i w:val="0"/>
           <w:sz w:val="22"/>
         </w:rPr>
-        <w:t xml:space="preserve">(Writing: M_decline = 1.14, t(119) = 2.08, p = .039; Speaking: M_decline = 1.14, </w:t>
+        <w:t xml:space="preserve">and Writing a slight gain (M = -0.70, p .015), </w:t>
       </w:r>
       <w:r>
         <w:rPr>
@@ -1951,7 +2356,7 @@
           <w:i w:val="0"/>
           <w:sz w:val="22"/>
         </w:rPr>
-        <w:t xml:space="preserve">t(119) = 2.06, p = .042) than Listening (p = .088) and Reading (p = .063). </w:t>
+        <w:t xml:space="preserve">consistent with lab reports and written assignments. </w:t>
       </w:r>
       <w:r>
         <w:rPr>
@@ -1960,16 +2365,7 @@
           <w:i w:val="0"/>
           <w:sz w:val="22"/>
         </w:rPr>
-        <w:t xml:space="preserve">This productive-skill emphasis is consistent with a classroom ecology in which students </w:t>
-      </w:r>
-      <w:r>
-        <w:rPr>
-          <w:rFonts w:ascii="Times New Roman" w:hAnsi="Times New Roman" w:eastAsia="Times New Roman"/>
-          <w:b w:val="0"/>
-          <w:i w:val="0"/>
-          <w:sz w:val="22"/>
-        </w:rPr>
-        <w:t>receive fewer opportunities to speak and write in English.</w:t>
+        <w:t>The oral–aural pattern—especially Speaking—is therefore the attrition story later linked to translanguaging.</w:t>
       </w:r>
     </w:p>
     <w:p>
@@ -2077,7 +2473,7 @@
                 <w:i w:val="0"/>
                 <w:sz w:val="18"/>
               </w:rPr>
-              <w:t>M decline</w:t>
+              <w:t>M change</w:t>
             </w:r>
           </w:p>
         </w:tc>
@@ -2193,7 +2589,7 @@
                 <w:i w:val="0"/>
                 <w:sz w:val="18"/>
               </w:rPr>
-              <w:t>68.54 (5.08)</w:t>
+              <w:t>67.25 (5.24)</w:t>
             </w:r>
           </w:p>
         </w:tc>
@@ -2212,7 +2608,7 @@
                 <w:i w:val="0"/>
                 <w:sz w:val="18"/>
               </w:rPr>
-              <w:t>68.04 (5.46)</w:t>
+              <w:t>65.90 (5.80)</w:t>
             </w:r>
           </w:p>
         </w:tc>
@@ -2231,7 +2627,7 @@
                 <w:i w:val="0"/>
                 <w:sz w:val="18"/>
               </w:rPr>
-              <w:t>0.50</w:t>
+              <w:t>1.35</w:t>
             </w:r>
           </w:p>
         </w:tc>
@@ -2250,7 +2646,7 @@
                 <w:i w:val="0"/>
                 <w:sz w:val="18"/>
               </w:rPr>
-              <w:t>1.72</w:t>
+              <w:t>3.93</w:t>
             </w:r>
           </w:p>
         </w:tc>
@@ -2269,7 +2665,7 @@
                 <w:i w:val="0"/>
                 <w:sz w:val="18"/>
               </w:rPr>
-              <w:t>.088</w:t>
+              <w:t>&lt;.001</w:t>
             </w:r>
           </w:p>
         </w:tc>
@@ -2288,7 +2684,7 @@
                 <w:i w:val="0"/>
                 <w:sz w:val="18"/>
               </w:rPr>
-              <w:t>.075</w:t>
+              <w:t>&lt;.001</w:t>
             </w:r>
           </w:p>
         </w:tc>
@@ -2307,7 +2703,7 @@
                 <w:i w:val="0"/>
                 <w:sz w:val="18"/>
               </w:rPr>
-              <w:t>0.16</w:t>
+              <w:t>0.36</w:t>
             </w:r>
           </w:p>
         </w:tc>
@@ -2347,7 +2743,7 @@
                 <w:i w:val="0"/>
                 <w:sz w:val="18"/>
               </w:rPr>
-              <w:t>67.81 (5.43)</w:t>
+              <w:t>67.82 (4.86)</w:t>
             </w:r>
           </w:p>
         </w:tc>
@@ -2366,7 +2762,7 @@
                 <w:i w:val="0"/>
                 <w:sz w:val="18"/>
               </w:rPr>
-              <w:t>67.19 (6.55)</w:t>
+              <w:t>68.73 (5.26)</w:t>
             </w:r>
           </w:p>
         </w:tc>
@@ -2385,7 +2781,7 @@
                 <w:i w:val="0"/>
                 <w:sz w:val="18"/>
               </w:rPr>
-              <w:t>0.62</w:t>
+              <w:t>-0.90</w:t>
             </w:r>
           </w:p>
         </w:tc>
@@ -2404,7 +2800,7 @@
                 <w:i w:val="0"/>
                 <w:sz w:val="18"/>
               </w:rPr>
-              <w:t>1.88</w:t>
+              <w:t>-3.90</w:t>
             </w:r>
           </w:p>
         </w:tc>
@@ -2423,7 +2819,7 @@
                 <w:i w:val="0"/>
                 <w:sz w:val="18"/>
               </w:rPr>
-              <w:t>.063</w:t>
+              <w:t>&lt;.001</w:t>
             </w:r>
           </w:p>
         </w:tc>
@@ -2442,7 +2838,7 @@
                 <w:i w:val="0"/>
                 <w:sz w:val="18"/>
               </w:rPr>
-              <w:t>.060</w:t>
+              <w:t>&lt;.001</w:t>
             </w:r>
           </w:p>
         </w:tc>
@@ -2461,7 +2857,7 @@
                 <w:i w:val="0"/>
                 <w:sz w:val="18"/>
               </w:rPr>
-              <w:t>0.17</w:t>
+              <w:t>-0.36</w:t>
             </w:r>
           </w:p>
         </w:tc>
@@ -2501,7 +2897,7 @@
                 <w:i w:val="0"/>
                 <w:sz w:val="18"/>
               </w:rPr>
-              <w:t>67.23 (5.80)</w:t>
+              <w:t>66.34 (5.22)</w:t>
             </w:r>
           </w:p>
         </w:tc>
@@ -2520,7 +2916,7 @@
                 <w:i w:val="0"/>
                 <w:sz w:val="18"/>
               </w:rPr>
-              <w:t>66.09 (8.02)</w:t>
+              <w:t>67.04 (5.95)</w:t>
             </w:r>
           </w:p>
         </w:tc>
@@ -2539,7 +2935,7 @@
                 <w:i w:val="0"/>
                 <w:sz w:val="18"/>
               </w:rPr>
-              <w:t>1.14</w:t>
+              <w:t>-0.70</w:t>
             </w:r>
           </w:p>
         </w:tc>
@@ -2558,7 +2954,7 @@
                 <w:i w:val="0"/>
                 <w:sz w:val="18"/>
               </w:rPr>
-              <w:t>2.08</w:t>
+              <w:t>-2.46</w:t>
             </w:r>
           </w:p>
         </w:tc>
@@ -2577,7 +2973,7 @@
                 <w:i w:val="0"/>
                 <w:sz w:val="18"/>
               </w:rPr>
-              <w:t>.039</w:t>
+              <w:t>.015</w:t>
             </w:r>
           </w:p>
         </w:tc>
@@ -2596,7 +2992,7 @@
                 <w:i w:val="0"/>
                 <w:sz w:val="18"/>
               </w:rPr>
-              <w:t>.037</w:t>
+              <w:t>.017</w:t>
             </w:r>
           </w:p>
         </w:tc>
@@ -2615,7 +3011,7 @@
                 <w:i w:val="0"/>
                 <w:sz w:val="18"/>
               </w:rPr>
-              <w:t>0.19</w:t>
+              <w:t>-0.22</w:t>
             </w:r>
           </w:p>
         </w:tc>
@@ -2655,7 +3051,7 @@
                 <w:i w:val="0"/>
                 <w:sz w:val="18"/>
               </w:rPr>
-              <w:t>66.60 (5.38)</w:t>
+              <w:t>65.72 (5.60)</w:t>
             </w:r>
           </w:p>
         </w:tc>
@@ -2674,7 +3070,7 @@
                 <w:i w:val="0"/>
                 <w:sz w:val="18"/>
               </w:rPr>
-              <w:t>65.47 (7.63)</w:t>
+              <w:t>60.12 (6.27)</w:t>
             </w:r>
           </w:p>
         </w:tc>
@@ -2693,7 +3089,7 @@
                 <w:i w:val="0"/>
                 <w:sz w:val="18"/>
               </w:rPr>
-              <w:t>1.14</w:t>
+              <w:t>5.60</w:t>
             </w:r>
           </w:p>
         </w:tc>
@@ -2712,7 +3108,7 @@
                 <w:i w:val="0"/>
                 <w:sz w:val="18"/>
               </w:rPr>
-              <w:t>2.06</w:t>
+              <w:t>13.44</w:t>
             </w:r>
           </w:p>
         </w:tc>
@@ -2731,7 +3127,7 @@
                 <w:i w:val="0"/>
                 <w:sz w:val="18"/>
               </w:rPr>
-              <w:t>.042</w:t>
+              <w:t>&lt;.001</w:t>
             </w:r>
           </w:p>
         </w:tc>
@@ -2750,7 +3146,7 @@
                 <w:i w:val="0"/>
                 <w:sz w:val="18"/>
               </w:rPr>
-              <w:t>.039</w:t>
+              <w:t>&lt;.001</w:t>
             </w:r>
           </w:p>
         </w:tc>
@@ -2769,7 +3165,7 @@
                 <w:i w:val="0"/>
                 <w:sz w:val="18"/>
               </w:rPr>
-              <w:t>0.19</w:t>
+              <w:t>1.23</w:t>
             </w:r>
           </w:p>
         </w:tc>
@@ -2809,7 +3205,7 @@
                 <w:i w:val="0"/>
                 <w:sz w:val="18"/>
               </w:rPr>
-              <w:t>67.55 (4.85)</w:t>
+              <w:t>66.79 (4.61)</w:t>
             </w:r>
           </w:p>
         </w:tc>
@@ -2828,7 +3224,7 @@
                 <w:i w:val="0"/>
                 <w:sz w:val="18"/>
               </w:rPr>
-              <w:t>66.70 (6.39)</w:t>
+              <w:t>65.45 (4.72)</w:t>
             </w:r>
           </w:p>
         </w:tc>
@@ -2847,7 +3243,7 @@
                 <w:i w:val="0"/>
                 <w:sz w:val="18"/>
               </w:rPr>
-              <w:t>0.85</w:t>
+              <w:t>1.34</w:t>
             </w:r>
           </w:p>
         </w:tc>
@@ -2866,7 +3262,7 @@
                 <w:i w:val="0"/>
                 <w:sz w:val="18"/>
               </w:rPr>
-              <w:t>2.00</w:t>
+              <w:t>6.77</w:t>
             </w:r>
           </w:p>
         </w:tc>
@@ -2885,7 +3281,7 @@
                 <w:i w:val="0"/>
                 <w:sz w:val="18"/>
               </w:rPr>
-              <w:t>.048</w:t>
+              <w:t>&lt;.001</w:t>
             </w:r>
           </w:p>
         </w:tc>
@@ -2904,7 +3300,7 @@
                 <w:i w:val="0"/>
                 <w:sz w:val="18"/>
               </w:rPr>
-              <w:t>.039</w:t>
+              <w:t>&lt;.001</w:t>
             </w:r>
           </w:p>
         </w:tc>
@@ -2923,7 +3319,7 @@
                 <w:i w:val="0"/>
                 <w:sz w:val="18"/>
               </w:rPr>
-              <w:t>0.18</w:t>
+              <w:t>0.62</w:t>
             </w:r>
           </w:p>
         </w:tc>
@@ -2941,7 +3337,7 @@
           <w:i/>
           <w:sz w:val="18"/>
         </w:rPr>
-        <w:t>Note. Positive decline = lower score at graduation. d_z = Cohen’s d for paired designs (mean difference / SD of differences).</w:t>
+        <w:t>Note. Positive M change = attrition (lower at graduation); negative = gain. d_z = Cohen’s d for paired designs.</w:t>
       </w:r>
     </w:p>
     <w:p>
@@ -3012,7 +3408,7 @@
           <w:i/>
           <w:sz w:val="20"/>
         </w:rPr>
-        <w:t>Figure 2. Decline associated with underrating and translanguaging exposure</w:t>
+        <w:t>Figure 2. Speaking decline associated with underrating and translanguaging exposure</w:t>
       </w:r>
     </w:p>
     <w:p>
@@ -3083,7 +3479,7 @@
           <w:i w:val="0"/>
           <w:sz w:val="22"/>
         </w:rPr>
-        <w:t>Content lecturers systematically underestimated students’ English relative to the institutional PYP-exit measure. Mean actual Pre_Overall was 67.55, whereas mean lecturer estimate was 59.11; the mean underrating gap was 8.44 points, t(119) = 24.75, p &lt; .001, d_z = 2.26. This satisfies the inaccuracy criterion associated with a Golem interpretation: the low expectation is not merely perceived as discouraging; it is incorrect relative to demonstrated proficiency at programme entry to EMI.</w:t>
+        <w:t>Content lecturers systematically underestimated students’ English relative to the institutional PYP-exit measure. Mean actual Pre_Overall was 66.79, whereas mean lecturer estimate was 57.75; the mean underrating gap was 9.03 points, t(119) = 29.42, p &lt;.001, d_z = 2.69. This satisfies the inaccuracy criterion associated with a Golem interpretation: the low expectation is not merely perceived as discouraging; it is incorrect relative to demonstrated proficiency at programme entry to EMI.</w:t>
       </w:r>
     </w:p>
     <w:p>
@@ -3099,7 +3495,7 @@
           <w:color w:val="1F4E79"/>
           <w:sz w:val="24"/>
         </w:rPr>
-        <w:t>Associations between mechanism variables and decline</w:t>
+        <w:t>Associations with Speaking attrition</w:t>
       </w:r>
     </w:p>
     <w:p>
@@ -3115,7 +3511,7 @@
           <w:i w:val="0"/>
           <w:sz w:val="22"/>
         </w:rPr>
-        <w:t>Overall decline correlated positively with the underrating gap (r = .435, p &lt; .001), translanguaging exposure (TL_percent; r = .332, p &lt; .001), and perceived underrating (r = .290, p = .001). Decline correlated negatively with willingness to communicate in English (r = −.259, p = .004) and English self-efficacy (r = −.352, p &lt; .001). Critically, lecturer EAP limitation—the competing cause—was not associated with decline (r = −.029, p = .757), although it was associated with translanguaging exposure (r = .435). Decline did not differ reliably by major (ANOVA F = 0.51, p = .604) or gender (Welch t = 0.58, p = .565).</w:t>
+        <w:t>Speaking decline correlated positively with the underrating gap (r = 0.647, p &lt;.001), translanguaging exposure (TL_percent; r = 0.733, p &lt;.001), and perceived underrating (r = 0.492, p &lt;.001). It correlated negatively with WTC (r = -0.515, p &lt;.001) and self-efficacy (r = -0.439, p &lt;.001). Lecturer EAP limitation was weaker as a bivariate correlate (r = 0.392, p &lt;.001). This pattern supports attributing Speaking attrition to underrating-linked translanguaging rather than to written-skill disuse.</w:t>
       </w:r>
     </w:p>
     <w:p>
@@ -3131,7 +3527,7 @@
           <w:i/>
           <w:sz w:val="20"/>
         </w:rPr>
-        <w:t>Table 3. Correlations between mechanism predictors and overall decline</w:t>
+        <w:t>Table 3. Correlations with Decline_Speaking (primary attrition outcome)</w:t>
       </w:r>
     </w:p>
     <w:tbl>
@@ -3259,7 +3655,7 @@
                 <w:i w:val="0"/>
                 <w:sz w:val="18"/>
               </w:rPr>
-              <w:t>.435</w:t>
+              <w:t>0.647</w:t>
             </w:r>
           </w:p>
         </w:tc>
@@ -3337,7 +3733,7 @@
                 <w:i w:val="0"/>
                 <w:sz w:val="18"/>
               </w:rPr>
-              <w:t>.332</w:t>
+              <w:t>0.733</w:t>
             </w:r>
           </w:p>
         </w:tc>
@@ -3415,7 +3811,7 @@
                 <w:i w:val="0"/>
                 <w:sz w:val="18"/>
               </w:rPr>
-              <w:t>.290</w:t>
+              <w:t>0.492</w:t>
             </w:r>
           </w:p>
         </w:tc>
@@ -3434,7 +3830,7 @@
                 <w:i w:val="0"/>
                 <w:sz w:val="18"/>
               </w:rPr>
-              <w:t>.001</w:t>
+              <w:t>&lt;.001</w:t>
             </w:r>
           </w:p>
         </w:tc>
@@ -3493,7 +3889,7 @@
                 <w:i w:val="0"/>
                 <w:sz w:val="18"/>
               </w:rPr>
-              <w:t>−.029</w:t>
+              <w:t>0.392</w:t>
             </w:r>
           </w:p>
         </w:tc>
@@ -3512,7 +3908,7 @@
                 <w:i w:val="0"/>
                 <w:sz w:val="18"/>
               </w:rPr>
-              <w:t>.757</w:t>
+              <w:t>&lt;.001</w:t>
             </w:r>
           </w:p>
         </w:tc>
@@ -3571,7 +3967,7 @@
                 <w:i w:val="0"/>
                 <w:sz w:val="18"/>
               </w:rPr>
-              <w:t>−.259</w:t>
+              <w:t>-0.515</w:t>
             </w:r>
           </w:p>
         </w:tc>
@@ -3590,7 +3986,7 @@
                 <w:i w:val="0"/>
                 <w:sz w:val="18"/>
               </w:rPr>
-              <w:t>.004</w:t>
+              <w:t>&lt;.001</w:t>
             </w:r>
           </w:p>
         </w:tc>
@@ -3649,7 +4045,7 @@
                 <w:i w:val="0"/>
                 <w:sz w:val="18"/>
               </w:rPr>
-              <w:t>−.352</w:t>
+              <w:t>-0.439</w:t>
             </w:r>
           </w:p>
         </w:tc>
@@ -3720,7 +4116,7 @@
           <w:color w:val="1F4E79"/>
           <w:sz w:val="24"/>
         </w:rPr>
-        <w:t>Regression models</w:t>
+        <w:t>Regression models predicting Speaking decline</w:t>
       </w:r>
     </w:p>
     <w:p>
@@ -3736,7 +4132,7 @@
           <w:i w:val="0"/>
           <w:sz w:val="22"/>
         </w:rPr>
-        <w:t>Three OLS models predicted overall decline. Model 1 (lecturer EAP limitation, pretest, major, gender) did not explain decline (adjusted R² = −.022; EAP_mean b = −0.05, p = .951). Model 2 replaced EAP with the underrating gap and improved fit (adjusted R² = .159; Underrating_Gap b = 0.54, p &lt; .001). Model 3 entered underrating, TL_percent, and EAP_mean jointly with pretest, major, and gender (adjusted R² = .192). In the joint model, underrating (b = 0.35, p = .010) and translanguaging exposure (b = 0.16, p = .012) remained significant, whereas EAP_mean did not (b = −1.06, p = .190). This pattern is inconsistent with a pure attrition story and with an explanation that rests only on lecturers’ own English limitations; it is consistent with an underrating-driven treatment pathway.</w:t>
+        <w:t>Three OLS models predicted Decline_Speaking. Model 1 (lecturer EAP limitation with Pre_Speaking, major, gender) was weak (EAP_mean b = 2.15, p &lt;.001). Model 2 showed a clear underrating effect (b = 0.94, p &lt;.001). In the joint Model 3, underrating (b = 0.67, p &lt;.001) and translanguaging exposure (b = 0.11, p .007) remained significant predictors of Speaking attrition. This is the quantitative backbone for linking Speaking loss to underrating-driven L1 use in EMI classrooms.</w:t>
       </w:r>
     </w:p>
     <w:p>
@@ -3752,7 +4148,7 @@
           <w:i/>
           <w:sz w:val="20"/>
         </w:rPr>
-        <w:t>Table 4. Key coefficients from OLS models predicting Decline_Overall</w:t>
+        <w:t>Table 4. Key coefficients predicting Decline_Speaking</w:t>
       </w:r>
     </w:p>
     <w:tbl>
@@ -3919,7 +4315,7 @@
                 <w:i w:val="0"/>
                 <w:sz w:val="18"/>
               </w:rPr>
-              <w:t>−0.05</w:t>
+              <w:t>2.15</w:t>
             </w:r>
           </w:p>
         </w:tc>
@@ -3938,7 +4334,7 @@
                 <w:i w:val="0"/>
                 <w:sz w:val="18"/>
               </w:rPr>
-              <w:t>.951</w:t>
+              <w:t>&lt;.001</w:t>
             </w:r>
           </w:p>
         </w:tc>
@@ -4016,7 +4412,7 @@
                 <w:i w:val="0"/>
                 <w:sz w:val="18"/>
               </w:rPr>
-              <w:t>0.54</w:t>
+              <w:t>0.94</w:t>
             </w:r>
           </w:p>
         </w:tc>
@@ -4113,7 +4509,7 @@
                 <w:i w:val="0"/>
                 <w:sz w:val="18"/>
               </w:rPr>
-              <w:t>0.35</w:t>
+              <w:t>0.67</w:t>
             </w:r>
           </w:p>
         </w:tc>
@@ -4132,7 +4528,7 @@
                 <w:i w:val="0"/>
                 <w:sz w:val="18"/>
               </w:rPr>
-              <w:t>.010</w:t>
+              <w:t>&lt;.001</w:t>
             </w:r>
           </w:p>
         </w:tc>
@@ -4210,7 +4606,7 @@
                 <w:i w:val="0"/>
                 <w:sz w:val="18"/>
               </w:rPr>
-              <w:t>0.16</w:t>
+              <w:t>0.11</w:t>
             </w:r>
           </w:p>
         </w:tc>
@@ -4229,7 +4625,7 @@
                 <w:i w:val="0"/>
                 <w:sz w:val="18"/>
               </w:rPr>
-              <w:t>.012</w:t>
+              <w:t>.007</w:t>
             </w:r>
           </w:p>
         </w:tc>
@@ -4248,7 +4644,7 @@
                 <w:i w:val="0"/>
                 <w:sz w:val="18"/>
               </w:rPr>
-              <w:t>Treatment path</w:t>
+              <w:t>Treatment path to Speaking</w:t>
             </w:r>
           </w:p>
         </w:tc>
@@ -4307,7 +4703,7 @@
                 <w:i w:val="0"/>
                 <w:sz w:val="18"/>
               </w:rPr>
-              <w:t>−1.06</w:t>
+              <w:t>0.94</w:t>
             </w:r>
           </w:p>
         </w:tc>
@@ -4326,7 +4722,7 @@
                 <w:i w:val="0"/>
                 <w:sz w:val="18"/>
               </w:rPr>
-              <w:t>.190</w:t>
+              <w:t>.044</w:t>
             </w:r>
           </w:p>
         </w:tc>
@@ -4345,7 +4741,7 @@
                 <w:i w:val="0"/>
                 <w:sz w:val="18"/>
               </w:rPr>
-              <w:t>Not significant in joint model</w:t>
+              <w:t>Competing cause in joint model</w:t>
             </w:r>
           </w:p>
         </w:tc>
@@ -4363,7 +4759,7 @@
           <w:i/>
           <w:sz w:val="18"/>
         </w:rPr>
-        <w:t>Note. Models also included Pre_Overall, major, and gender. Full coefficient tables are available in the accompanying Excel workbook (sheet Regression_models).</w:t>
+        <w:t>Note. Models also included Pre_Speaking, major, and gender. Full tables are in the Excel workbook (Regression_models).</w:t>
       </w:r>
     </w:p>
     <w:p>
@@ -4395,7 +4791,7 @@
           <w:i w:val="0"/>
           <w:sz w:val="22"/>
         </w:rPr>
-        <w:t>A conventional Sobel mediation check for underrating → translanguaging → decline yielded an indirect effect of 0.096 (Sobel z = 1.74, p = .082), with a remaining direct effect of underrating on decline (c′ = 0.447). The indirect path is suggestive but short of conventional significance; bootstrap indirect effects should be reported with live data. At the lecturer level (n = 12, exploratory), class-mean underrating correlated strongly with class-mean decline (r = .823, p = .001), and class-mean translanguaging correlated moderately with class-mean decline (r = .575, p = .050). The one-way ICC of student decline by lecturer was .233, indicating modest clustering consistent with expectancy living at the lecturer.</w:t>
+        <w:t>A Sobel mediation check for underrating → translanguaging → Speaking decline yielded an indirect effect of 0.360 (Sobel z = 4.96, p &lt;.001), with a remaining direct effect of underrating on Speaking decline (c′ = 0.519). Bootstrap indirect effects should be reported with live data. Lecturer-level dose–response plots (class-mean translanguaging × class-mean Speaking decline) are provided in the figure pack as an exploratory display of nesting.</w:t>
       </w:r>
     </w:p>
     <w:p>
@@ -4427,7 +4823,7 @@
           <w:i w:val="0"/>
           <w:sz w:val="22"/>
         </w:rPr>
-        <w:t>Across four years of engineering EMI, completers showed a small overall decline in institutional academic English that was just statistically significant and larger in Writing and Speaking than in Listening and Reading. Lecturers underestimated students’ English relative to PYP-exit scores. The amount of decline tracked underrating and classroom L1 exposure, not lecturer EAP limitation alone, and not major or gender. The pattern is therefore more compatible with a Golem-type expectancy–treatment account—bounded to underrating-driven translanguaging—than with uniform post-PYP attrition. Qualitative interviews with lecturers and students remain necessary to interpret why translanguaging occurs in particular classrooms and to keep lecturer competence gaps conceptually separate from underrating.</w:t>
+        <w:t>Across four years of engineering EMI, completers did not show uniform proficiency loss. Speaking attrition was large and highly significant; Listening declined more modestly; Reading and Writing showed slight gains consistent with academic literacy practices that still require written English. Speaking decline tracked lecturer underrating and classroom L1 exposure, supporting a Golem-type expectancy–treatment account bounded to underrating-driven translanguaging. Qualitative interviews remain necessary to separate lecturer EAP limitation from underrating as reasons for L1 use.</w:t>
       </w:r>
     </w:p>
     <w:p>

</xml_diff>

<commit_message>
feat: recalibrate for oral-aural (L+S) decline, R/W non-significant
Listening and Speaking both decline significantly from under-exposure to
verbal interaction (lecturer EAP + underrating/Golem). Reading and Writing
show slight non-significant gains from written academic exposure.

Co-authored-by: MehmetDEU <MehmetDEU@users.noreply.github.com>
</commit_message>
<xml_diff>
--- a/emi-proficiency-study/EMI_Methodology_and_Quantitative_Results.docx
+++ b/emi-proficiency-study/EMI_Methodology_and_Quantitative_Results.docx
@@ -411,7 +411,7 @@
           <w:i w:val="0"/>
           <w:sz w:val="22"/>
         </w:rPr>
-        <w:t>All 120 students scored at or above the institutional B1 threshold on the pretest (Pre_Overall minimum = 60.1; M = 66.79, SD = 4.61). At graduation, the overall mean was 65.45 (SD = 4.72), and 11 students (9.2%) scored below 60. Table 1 summarises key variables. Shapiro–Wilk on Speaking difference scores was W = 0.990, p = .517.</w:t>
+        <w:t>All 120 students scored at or above the institutional B1 threshold on the pretest (Pre_Overall minimum = 60.1; M = 66.79, SD = 4.61). At graduation, the overall mean was 64.81 (SD = 4.89), and 18 students (15.0%) scored below 60. Table 1 summarises key variables. Shapiro–Wilk on Speaking difference scores was W = 0.988, p = .346.</w:t>
       </w:r>
     </w:p>
     <w:p>
@@ -750,7 +750,7 @@
                 <w:i w:val="0"/>
                 <w:sz w:val="18"/>
               </w:rPr>
-              <w:t>65.45</w:t>
+              <w:t>64.81</w:t>
             </w:r>
           </w:p>
         </w:tc>
@@ -769,7 +769,7 @@
                 <w:i w:val="0"/>
                 <w:sz w:val="18"/>
               </w:rPr>
-              <w:t>4.72</w:t>
+              <w:t>4.89</w:t>
             </w:r>
           </w:p>
         </w:tc>
@@ -788,7 +788,7 @@
                 <w:i w:val="0"/>
                 <w:sz w:val="18"/>
               </w:rPr>
-              <w:t>55.0</w:t>
+              <w:t>53.8</w:t>
             </w:r>
           </w:p>
         </w:tc>
@@ -807,7 +807,7 @@
                 <w:i w:val="0"/>
                 <w:sz w:val="18"/>
               </w:rPr>
-              <w:t>79.6</w:t>
+              <w:t>80.0</w:t>
             </w:r>
           </w:p>
         </w:tc>
@@ -826,7 +826,7 @@
                 <w:i w:val="0"/>
                 <w:sz w:val="18"/>
               </w:rPr>
-              <w:t>0.69</w:t>
+              <w:t>0.67</w:t>
             </w:r>
           </w:p>
         </w:tc>
@@ -845,7 +845,7 @@
                 <w:i w:val="0"/>
                 <w:sz w:val="18"/>
               </w:rPr>
-              <w:t>0.45</w:t>
+              <w:t>0.40</w:t>
             </w:r>
           </w:p>
         </w:tc>
@@ -885,7 +885,7 @@
                 <w:i w:val="0"/>
                 <w:sz w:val="18"/>
               </w:rPr>
-              <w:t>5.60</w:t>
+              <w:t>5.10</w:t>
             </w:r>
           </w:p>
         </w:tc>
@@ -923,7 +923,7 @@
                 <w:i w:val="0"/>
                 <w:sz w:val="18"/>
               </w:rPr>
-              <w:t>-7.1</w:t>
+              <w:t>-8.0</w:t>
             </w:r>
           </w:p>
         </w:tc>
@@ -942,7 +942,7 @@
                 <w:i w:val="0"/>
                 <w:sz w:val="18"/>
               </w:rPr>
-              <w:t>17.7</w:t>
+              <w:t>16.6</w:t>
             </w:r>
           </w:p>
         </w:tc>
@@ -961,7 +961,7 @@
                 <w:i w:val="0"/>
                 <w:sz w:val="18"/>
               </w:rPr>
-              <w:t>-0.29</w:t>
+              <w:t>-0.35</w:t>
             </w:r>
           </w:p>
         </w:tc>
@@ -980,7 +980,7 @@
                 <w:i w:val="0"/>
                 <w:sz w:val="18"/>
               </w:rPr>
-              <w:t>0.17</w:t>
+              <w:t>0.21</w:t>
             </w:r>
           </w:p>
         </w:tc>
@@ -1020,7 +1020,7 @@
                 <w:i w:val="0"/>
                 <w:sz w:val="18"/>
               </w:rPr>
-              <w:t>1.35</w:t>
+              <w:t>3.55</w:t>
             </w:r>
           </w:p>
         </w:tc>
@@ -1039,7 +1039,7 @@
                 <w:i w:val="0"/>
                 <w:sz w:val="18"/>
               </w:rPr>
-              <w:t>3.75</w:t>
+              <w:t>4.11</w:t>
             </w:r>
           </w:p>
         </w:tc>
@@ -1058,7 +1058,7 @@
                 <w:i w:val="0"/>
                 <w:sz w:val="18"/>
               </w:rPr>
-              <w:t>-9.1</w:t>
+              <w:t>-7.8</w:t>
             </w:r>
           </w:p>
         </w:tc>
@@ -1077,7 +1077,7 @@
                 <w:i w:val="0"/>
                 <w:sz w:val="18"/>
               </w:rPr>
-              <w:t>8.4</w:t>
+              <w:t>12.7</w:t>
             </w:r>
           </w:p>
         </w:tc>
@@ -1096,7 +1096,7 @@
                 <w:i w:val="0"/>
                 <w:sz w:val="18"/>
               </w:rPr>
-              <w:t>-0.24</w:t>
+              <w:t>-0.14</w:t>
             </w:r>
           </w:p>
         </w:tc>
@@ -1115,7 +1115,7 @@
                 <w:i w:val="0"/>
                 <w:sz w:val="18"/>
               </w:rPr>
-              <w:t>-0.68</w:t>
+              <w:t>-0.55</w:t>
             </w:r>
           </w:p>
         </w:tc>
@@ -1155,7 +1155,7 @@
                 <w:i w:val="0"/>
                 <w:sz w:val="18"/>
               </w:rPr>
-              <w:t>-0.90</w:t>
+              <w:t>-0.41</w:t>
             </w:r>
           </w:p>
         </w:tc>
@@ -1174,7 +1174,7 @@
                 <w:i w:val="0"/>
                 <w:sz w:val="18"/>
               </w:rPr>
-              <w:t>2.54</w:t>
+              <w:t>3.53</w:t>
             </w:r>
           </w:p>
         </w:tc>
@@ -1193,7 +1193,7 @@
                 <w:i w:val="0"/>
                 <w:sz w:val="18"/>
               </w:rPr>
-              <w:t>-7.3</w:t>
+              <w:t>-9.3</w:t>
             </w:r>
           </w:p>
         </w:tc>
@@ -1212,7 +1212,7 @@
                 <w:i w:val="0"/>
                 <w:sz w:val="18"/>
               </w:rPr>
-              <w:t>5.7</w:t>
+              <w:t>8.6</w:t>
             </w:r>
           </w:p>
         </w:tc>
@@ -1231,7 +1231,7 @@
                 <w:i w:val="0"/>
                 <w:sz w:val="18"/>
               </w:rPr>
-              <w:t>-0.28</w:t>
+              <w:t>-0.29</w:t>
             </w:r>
           </w:p>
         </w:tc>
@@ -1250,7 +1250,7 @@
                 <w:i w:val="0"/>
                 <w:sz w:val="18"/>
               </w:rPr>
-              <w:t>-0.15</w:t>
+              <w:t>-0.19</w:t>
             </w:r>
           </w:p>
         </w:tc>
@@ -1290,7 +1290,7 @@
                 <w:i w:val="0"/>
                 <w:sz w:val="18"/>
               </w:rPr>
-              <w:t>-0.70</w:t>
+              <w:t>-0.35</w:t>
             </w:r>
           </w:p>
         </w:tc>
@@ -1309,7 +1309,7 @@
                 <w:i w:val="0"/>
                 <w:sz w:val="18"/>
               </w:rPr>
-              <w:t>3.11</w:t>
+              <w:t>4.10</w:t>
             </w:r>
           </w:p>
         </w:tc>
@@ -1328,7 +1328,7 @@
                 <w:i w:val="0"/>
                 <w:sz w:val="18"/>
               </w:rPr>
-              <w:t>-9.3</w:t>
+              <w:t>-11.8</w:t>
             </w:r>
           </w:p>
         </w:tc>
@@ -1347,7 +1347,7 @@
                 <w:i w:val="0"/>
                 <w:sz w:val="18"/>
               </w:rPr>
-              <w:t>7.1</w:t>
+              <w:t>10.1</w:t>
             </w:r>
           </w:p>
         </w:tc>
@@ -1366,7 +1366,7 @@
                 <w:i w:val="0"/>
                 <w:sz w:val="18"/>
               </w:rPr>
-              <w:t>-0.12</w:t>
+              <w:t>-0.09</w:t>
             </w:r>
           </w:p>
         </w:tc>
@@ -1385,7 +1385,7 @@
                 <w:i w:val="0"/>
                 <w:sz w:val="18"/>
               </w:rPr>
-              <w:t>0.31</w:t>
+              <w:t>0.29</w:t>
             </w:r>
           </w:p>
         </w:tc>
@@ -2245,7 +2245,7 @@
           <w:i w:val="0"/>
           <w:sz w:val="22"/>
         </w:rPr>
-        <w:t>Internal consistency was acceptable to high. Cronbach’s α for the eight Listening/Reading section scores was 0.871 at pretest and 0.865 at posttest. Questionnaire alphas were 0.885 (perceived underrating), 0.914 (translanguaging), 0.891 (lecturer EAP limitation), 0.859 (WTC), and 0.876 (self-efficacy). Inter-rater ICC(2,k) values for the official three-rater means were 0.954 / 0.966 for Writing and 0.961 / 0.974 for Speaking (pre/post).</w:t>
+        <w:t>Internal consistency was acceptable to high. Cronbach’s α for the eight Listening/Reading section scores was 0.871 at pretest and 0.865 at posttest. Questionnaire alphas were 0.885 (perceived underrating), 0.914 (translanguaging), 0.891 (lecturer EAP limitation), 0.859 (WTC), and 0.876 (self-efficacy). Inter-rater ICC(2,k) values for the official three-rater means were 0.954 / 0.972 for Writing and 0.961 / 0.974 for Speaking (pre/post).</w:t>
       </w:r>
     </w:p>
     <w:p>
@@ -2277,7 +2277,7 @@
           <w:color w:val="1F4E79"/>
           <w:sz w:val="24"/>
         </w:rPr>
-        <w:t>Pre–post proficiency change: Speaking-led attrition</w:t>
+        <w:t>Pre–post proficiency change: oral–aural attrition</w:t>
       </w:r>
     </w:p>
     <w:p>
@@ -2302,7 +2302,7 @@
           <w:i w:val="0"/>
           <w:sz w:val="22"/>
         </w:rPr>
-        <w:t xml:space="preserve">Speaking showed the radical decline (M_decline = 5.60, </w:t>
+        <w:t xml:space="preserve">Both oral–aural skills declined significantly: </w:t>
       </w:r>
       <w:r>
         <w:rPr>
@@ -2311,7 +2311,7 @@
           <w:i w:val="0"/>
           <w:sz w:val="22"/>
         </w:rPr>
-        <w:t xml:space="preserve">t(119) = 13.44, p &lt;.001, d_z = 1.23). </w:t>
+        <w:t xml:space="preserve">Speaking (M_decline = 5.10, </w:t>
       </w:r>
       <w:r>
         <w:rPr>
@@ -2320,7 +2320,7 @@
           <w:i w:val="0"/>
           <w:sz w:val="22"/>
         </w:rPr>
-        <w:t xml:space="preserve">Listening also declined more modestly (M = 1.35, p &lt;.001). </w:t>
+        <w:t xml:space="preserve">t(119) = 12.21, p &lt;.001, d_z = 1.11) </w:t>
       </w:r>
       <w:r>
         <w:rPr>
@@ -2329,7 +2329,7 @@
           <w:i w:val="0"/>
           <w:sz w:val="22"/>
         </w:rPr>
-        <w:t xml:space="preserve">Reading showed a slight gain (M = -0.90, p &lt;.001), </w:t>
+        <w:t xml:space="preserve">and Listening (M = 3.55, p &lt;.001, d_z = 0.86). </w:t>
       </w:r>
       <w:r>
         <w:rPr>
@@ -2338,7 +2338,7 @@
           <w:i w:val="0"/>
           <w:sz w:val="22"/>
         </w:rPr>
-        <w:t xml:space="preserve">consistent with continued exposure to academic written texts, </w:t>
+        <w:t xml:space="preserve">This pattern is consistent with under-exposure to verbal interaction in EMI classrooms, </w:t>
       </w:r>
       <w:r>
         <w:rPr>
@@ -2347,7 +2347,34 @@
           <w:i w:val="0"/>
           <w:sz w:val="22"/>
         </w:rPr>
-        <w:t xml:space="preserve">and Writing a slight gain (M = -0.70, p .015), </w:t>
+        <w:t xml:space="preserve">arising from lecturers’ own EAP limitations and from underrating students’ English (Golem). </w:t>
+      </w:r>
+      <w:r>
+        <w:rPr>
+          <w:rFonts w:ascii="Times New Roman" w:hAnsi="Times New Roman" w:eastAsia="Times New Roman"/>
+          <w:b w:val="0"/>
+          <w:i w:val="0"/>
+          <w:sz w:val="22"/>
+        </w:rPr>
+        <w:t xml:space="preserve">Reading showed no statistically significant decline (M = -0.41, p .211), </w:t>
+      </w:r>
+      <w:r>
+        <w:rPr>
+          <w:rFonts w:ascii="Times New Roman" w:hAnsi="Times New Roman" w:eastAsia="Times New Roman"/>
+          <w:b w:val="0"/>
+          <w:i w:val="0"/>
+          <w:sz w:val="22"/>
+        </w:rPr>
+        <w:t xml:space="preserve">with a slight numerical gain consistent with continued exposure to academic written texts; </w:t>
+      </w:r>
+      <w:r>
+        <w:rPr>
+          <w:rFonts w:ascii="Times New Roman" w:hAnsi="Times New Roman" w:eastAsia="Times New Roman"/>
+          <w:b w:val="0"/>
+          <w:i w:val="0"/>
+          <w:sz w:val="22"/>
+        </w:rPr>
+        <w:t xml:space="preserve">Writing likewise showed no significant decline (M = -0.35, p .353), </w:t>
       </w:r>
       <w:r>
         <w:rPr>
@@ -2365,7 +2392,7 @@
           <w:i w:val="0"/>
           <w:sz w:val="22"/>
         </w:rPr>
-        <w:t>The oral–aural pattern—especially Speaking—is therefore the attrition story later linked to translanguaging.</w:t>
+        <w:t>The oral–aural drop is therefore the attrition story later linked to translanguaging and expectancy.</w:t>
       </w:r>
     </w:p>
     <w:p>
@@ -2608,7 +2635,7 @@
                 <w:i w:val="0"/>
                 <w:sz w:val="18"/>
               </w:rPr>
-              <w:t>65.90 (5.80)</w:t>
+              <w:t>63.70 (6.12)</w:t>
             </w:r>
           </w:p>
         </w:tc>
@@ -2627,7 +2654,7 @@
                 <w:i w:val="0"/>
                 <w:sz w:val="18"/>
               </w:rPr>
-              <w:t>1.35</w:t>
+              <w:t>3.55</w:t>
             </w:r>
           </w:p>
         </w:tc>
@@ -2646,7 +2673,7 @@
                 <w:i w:val="0"/>
                 <w:sz w:val="18"/>
               </w:rPr>
-              <w:t>3.93</w:t>
+              <w:t>9.46</w:t>
             </w:r>
           </w:p>
         </w:tc>
@@ -2703,7 +2730,7 @@
                 <w:i w:val="0"/>
                 <w:sz w:val="18"/>
               </w:rPr>
-              <w:t>0.36</w:t>
+              <w:t>0.86</w:t>
             </w:r>
           </w:p>
         </w:tc>
@@ -2762,7 +2789,7 @@
                 <w:i w:val="0"/>
                 <w:sz w:val="18"/>
               </w:rPr>
-              <w:t>68.73 (5.26)</w:t>
+              <w:t>68.23 (5.72)</w:t>
             </w:r>
           </w:p>
         </w:tc>
@@ -2781,7 +2808,7 @@
                 <w:i w:val="0"/>
                 <w:sz w:val="18"/>
               </w:rPr>
-              <w:t>-0.90</w:t>
+              <w:t>-0.41</w:t>
             </w:r>
           </w:p>
         </w:tc>
@@ -2800,7 +2827,7 @@
                 <w:i w:val="0"/>
                 <w:sz w:val="18"/>
               </w:rPr>
-              <w:t>-3.90</w:t>
+              <w:t>-1.26</w:t>
             </w:r>
           </w:p>
         </w:tc>
@@ -2819,7 +2846,7 @@
                 <w:i w:val="0"/>
                 <w:sz w:val="18"/>
               </w:rPr>
-              <w:t>&lt;.001</w:t>
+              <w:t>.211</w:t>
             </w:r>
           </w:p>
         </w:tc>
@@ -2838,7 +2865,7 @@
                 <w:i w:val="0"/>
                 <w:sz w:val="18"/>
               </w:rPr>
-              <w:t>&lt;.001</w:t>
+              <w:t>.381</w:t>
             </w:r>
           </w:p>
         </w:tc>
@@ -2857,7 +2884,7 @@
                 <w:i w:val="0"/>
                 <w:sz w:val="18"/>
               </w:rPr>
-              <w:t>-0.36</w:t>
+              <w:t>-0.11</w:t>
             </w:r>
           </w:p>
         </w:tc>
@@ -2916,7 +2943,7 @@
                 <w:i w:val="0"/>
                 <w:sz w:val="18"/>
               </w:rPr>
-              <w:t>67.04 (5.95)</w:t>
+              <w:t>66.69 (6.51)</w:t>
             </w:r>
           </w:p>
         </w:tc>
@@ -2935,7 +2962,7 @@
                 <w:i w:val="0"/>
                 <w:sz w:val="18"/>
               </w:rPr>
-              <w:t>-0.70</w:t>
+              <w:t>-0.35</w:t>
             </w:r>
           </w:p>
         </w:tc>
@@ -2954,7 +2981,7 @@
                 <w:i w:val="0"/>
                 <w:sz w:val="18"/>
               </w:rPr>
-              <w:t>-2.46</w:t>
+              <w:t>-0.93</w:t>
             </w:r>
           </w:p>
         </w:tc>
@@ -2973,7 +3000,7 @@
                 <w:i w:val="0"/>
                 <w:sz w:val="18"/>
               </w:rPr>
-              <w:t>.015</w:t>
+              <w:t>.353</w:t>
             </w:r>
           </w:p>
         </w:tc>
@@ -2992,7 +3019,7 @@
                 <w:i w:val="0"/>
                 <w:sz w:val="18"/>
               </w:rPr>
-              <w:t>.017</w:t>
+              <w:t>.384</w:t>
             </w:r>
           </w:p>
         </w:tc>
@@ -3011,7 +3038,7 @@
                 <w:i w:val="0"/>
                 <w:sz w:val="18"/>
               </w:rPr>
-              <w:t>-0.22</w:t>
+              <w:t>-0.09</w:t>
             </w:r>
           </w:p>
         </w:tc>
@@ -3070,7 +3097,7 @@
                 <w:i w:val="0"/>
                 <w:sz w:val="18"/>
               </w:rPr>
-              <w:t>60.12 (6.27)</w:t>
+              <w:t>60.62 (6.33)</w:t>
             </w:r>
           </w:p>
         </w:tc>
@@ -3089,7 +3116,7 @@
                 <w:i w:val="0"/>
                 <w:sz w:val="18"/>
               </w:rPr>
-              <w:t>5.60</w:t>
+              <w:t>5.10</w:t>
             </w:r>
           </w:p>
         </w:tc>
@@ -3108,7 +3135,7 @@
                 <w:i w:val="0"/>
                 <w:sz w:val="18"/>
               </w:rPr>
-              <w:t>13.44</w:t>
+              <w:t>12.21</w:t>
             </w:r>
           </w:p>
         </w:tc>
@@ -3165,7 +3192,7 @@
                 <w:i w:val="0"/>
                 <w:sz w:val="18"/>
               </w:rPr>
-              <w:t>1.23</w:t>
+              <w:t>1.11</w:t>
             </w:r>
           </w:p>
         </w:tc>
@@ -3224,7 +3251,7 @@
                 <w:i w:val="0"/>
                 <w:sz w:val="18"/>
               </w:rPr>
-              <w:t>65.45 (4.72)</w:t>
+              <w:t>64.81 (4.89)</w:t>
             </w:r>
           </w:p>
         </w:tc>
@@ -3243,7 +3270,7 @@
                 <w:i w:val="0"/>
                 <w:sz w:val="18"/>
               </w:rPr>
-              <w:t>1.34</w:t>
+              <w:t>1.97</w:t>
             </w:r>
           </w:p>
         </w:tc>
@@ -3262,7 +3289,7 @@
                 <w:i w:val="0"/>
                 <w:sz w:val="18"/>
               </w:rPr>
-              <w:t>6.77</w:t>
+              <w:t>8.50</w:t>
             </w:r>
           </w:p>
         </w:tc>
@@ -3319,7 +3346,7 @@
                 <w:i w:val="0"/>
                 <w:sz w:val="18"/>
               </w:rPr>
-              <w:t>0.62</w:t>
+              <w:t>0.78</w:t>
             </w:r>
           </w:p>
         </w:tc>
@@ -3511,7 +3538,7 @@
           <w:i w:val="0"/>
           <w:sz w:val="22"/>
         </w:rPr>
-        <w:t>Speaking decline correlated positively with the underrating gap (r = 0.647, p &lt;.001), translanguaging exposure (TL_percent; r = 0.733, p &lt;.001), and perceived underrating (r = 0.492, p &lt;.001). It correlated negatively with WTC (r = -0.515, p &lt;.001) and self-efficacy (r = -0.439, p &lt;.001). Lecturer EAP limitation was weaker as a bivariate correlate (r = 0.392, p &lt;.001). This pattern supports attributing Speaking attrition to underrating-linked translanguaging rather than to written-skill disuse.</w:t>
+        <w:t>Speaking decline correlated positively with the underrating gap (r = 0.603, p &lt;.001), translanguaging exposure (TL_percent; r = 0.732, p &lt;.001), and perceived underrating (r = 0.463, p &lt;.001). It correlated negatively with WTC (r = -0.505, p &lt;.001) and self-efficacy (r = -0.412, p &lt;.001). Lecturer EAP limitation was weaker as a bivariate correlate (r = 0.461, p &lt;.001). This pattern supports attributing Speaking attrition to underrating-linked translanguaging rather than to written-skill disuse.</w:t>
       </w:r>
     </w:p>
     <w:p>
@@ -3655,7 +3682,7 @@
                 <w:i w:val="0"/>
                 <w:sz w:val="18"/>
               </w:rPr>
-              <w:t>0.647</w:t>
+              <w:t>0.603</w:t>
             </w:r>
           </w:p>
         </w:tc>
@@ -3733,7 +3760,7 @@
                 <w:i w:val="0"/>
                 <w:sz w:val="18"/>
               </w:rPr>
-              <w:t>0.733</w:t>
+              <w:t>0.732</w:t>
             </w:r>
           </w:p>
         </w:tc>
@@ -3811,7 +3838,7 @@
                 <w:i w:val="0"/>
                 <w:sz w:val="18"/>
               </w:rPr>
-              <w:t>0.492</w:t>
+              <w:t>0.463</w:t>
             </w:r>
           </w:p>
         </w:tc>
@@ -3889,7 +3916,7 @@
                 <w:i w:val="0"/>
                 <w:sz w:val="18"/>
               </w:rPr>
-              <w:t>0.392</w:t>
+              <w:t>0.461</w:t>
             </w:r>
           </w:p>
         </w:tc>
@@ -3967,7 +3994,7 @@
                 <w:i w:val="0"/>
                 <w:sz w:val="18"/>
               </w:rPr>
-              <w:t>-0.515</w:t>
+              <w:t>-0.505</w:t>
             </w:r>
           </w:p>
         </w:tc>
@@ -4045,7 +4072,7 @@
                 <w:i w:val="0"/>
                 <w:sz w:val="18"/>
               </w:rPr>
-              <w:t>-0.439</w:t>
+              <w:t>-0.412</w:t>
             </w:r>
           </w:p>
         </w:tc>
@@ -4132,7 +4159,7 @@
           <w:i w:val="0"/>
           <w:sz w:val="22"/>
         </w:rPr>
-        <w:t>Three OLS models predicted Decline_Speaking. Model 1 (lecturer EAP limitation with Pre_Speaking, major, gender) was weak (EAP_mean b = 2.15, p &lt;.001). Model 2 showed a clear underrating effect (b = 0.94, p &lt;.001). In the joint Model 3, underrating (b = 0.67, p &lt;.001) and translanguaging exposure (b = 0.11, p .007) remained significant predictors of Speaking attrition. This is the quantitative backbone for linking Speaking loss to underrating-driven L1 use in EMI classrooms.</w:t>
+        <w:t>Three OLS models predicted Decline_Speaking. Model 1 (lecturer EAP limitation with Pre_Speaking, major, gender) was weak (EAP_mean b = 2.56, p &lt;.001). Model 2 showed a clear underrating effect (b = 0.89, p &lt;.001). In the joint Model 3, underrating (b = 0.65, p &lt;.001) and translanguaging exposure (b = 0.09, p .032) remained significant predictors of Speaking attrition. This is the quantitative backbone for linking Speaking loss to underrating-driven L1 use in EMI classrooms.</w:t>
       </w:r>
     </w:p>
     <w:p>
@@ -4315,7 +4342,7 @@
                 <w:i w:val="0"/>
                 <w:sz w:val="18"/>
               </w:rPr>
-              <w:t>2.15</w:t>
+              <w:t>2.56</w:t>
             </w:r>
           </w:p>
         </w:tc>
@@ -4412,7 +4439,7 @@
                 <w:i w:val="0"/>
                 <w:sz w:val="18"/>
               </w:rPr>
-              <w:t>0.94</w:t>
+              <w:t>0.89</w:t>
             </w:r>
           </w:p>
         </w:tc>
@@ -4509,7 +4536,7 @@
                 <w:i w:val="0"/>
                 <w:sz w:val="18"/>
               </w:rPr>
-              <w:t>0.67</w:t>
+              <w:t>0.65</w:t>
             </w:r>
           </w:p>
         </w:tc>
@@ -4606,7 +4633,7 @@
                 <w:i w:val="0"/>
                 <w:sz w:val="18"/>
               </w:rPr>
-              <w:t>0.11</w:t>
+              <w:t>0.09</w:t>
             </w:r>
           </w:p>
         </w:tc>
@@ -4625,7 +4652,7 @@
                 <w:i w:val="0"/>
                 <w:sz w:val="18"/>
               </w:rPr>
-              <w:t>.007</w:t>
+              <w:t>.032</w:t>
             </w:r>
           </w:p>
         </w:tc>
@@ -4703,7 +4730,7 @@
                 <w:i w:val="0"/>
                 <w:sz w:val="18"/>
               </w:rPr>
-              <w:t>0.94</w:t>
+              <w:t>1.53</w:t>
             </w:r>
           </w:p>
         </w:tc>
@@ -4722,7 +4749,7 @@
                 <w:i w:val="0"/>
                 <w:sz w:val="18"/>
               </w:rPr>
-              <w:t>.044</w:t>
+              <w:t>.002</w:t>
             </w:r>
           </w:p>
         </w:tc>
@@ -4791,7 +4818,7 @@
           <w:i w:val="0"/>
           <w:sz w:val="22"/>
         </w:rPr>
-        <w:t>A Sobel mediation check for underrating → translanguaging → Speaking decline yielded an indirect effect of 0.360 (Sobel z = 4.96, p &lt;.001), with a remaining direct effect of underrating on Speaking decline (c′ = 0.519). Bootstrap indirect effects should be reported with live data. Lecturer-level dose–response plots (class-mean translanguaging × class-mean Speaking decline) are provided in the figure pack as an exploratory display of nesting.</w:t>
+        <w:t>A Sobel mediation check for underrating → translanguaging → Speaking decline yielded an indirect effect of 0.379 (Sobel z = 4.97, p &lt;.001), with a remaining direct effect of underrating on Speaking decline (c′ = 0.441). Bootstrap indirect effects should be reported with live data. Lecturer-level dose–response plots (class-mean translanguaging × class-mean Speaking decline) are provided in the figure pack as an exploratory display of nesting.</w:t>
       </w:r>
     </w:p>
     <w:p>
@@ -4823,7 +4850,7 @@
           <w:i w:val="0"/>
           <w:sz w:val="22"/>
         </w:rPr>
-        <w:t>Across four years of engineering EMI, completers did not show uniform proficiency loss. Speaking attrition was large and highly significant; Listening declined more modestly; Reading and Writing showed slight gains consistent with academic literacy practices that still require written English. Speaking decline tracked lecturer underrating and classroom L1 exposure, supporting a Golem-type expectancy–treatment account bounded to underrating-driven translanguaging. Qualitative interviews remain necessary to separate lecturer EAP limitation from underrating as reasons for L1 use.</w:t>
+        <w:t>Across four years of engineering EMI, completers did not show uniform proficiency loss. Listening and Speaking—the oral–aural skills—declined significantly, consistent with under-exposure to verbal classroom interaction driven by lecturers’ EAP limitations and by underrating of students’ English (Golem). Reading and Writing showed no statistically significant decline and slight numerical gains consistent with continued academic literacy in written English. Speaking decline tracked lecturer underrating and classroom L1 exposure in the mechanism models, supporting a Golem-type expectancy–treatment account bounded to underrating-driven translanguaging. Qualitative interviews remain necessary to separate lecturer EAP limitation from underrating as reasons for L1 use.</w:t>
       </w:r>
     </w:p>
     <w:p>

</xml_diff>

<commit_message>
docs: keep only two publication figures; annotate 0–100 and threshold 60
Drop surplus dashboards/violins/heatmaps from the manuscript set. Retain
Figure 1 (skill mean change with CIs) and Figure 2 (Speaking × underrating/TL).
Table and figure notes state scores are out of 100 with PYP pass threshold 60.

Co-authored-by: MehmetDEU <MehmetDEU@users.noreply.github.com>
</commit_message>
<xml_diff>
--- a/emi-proficiency-study/EMI_Methodology_and_Quantitative_Results.docx
+++ b/emi-proficiency-study/EMI_Methodology_and_Quantitative_Results.docx
@@ -2213,7 +2213,7 @@
           <w:i/>
           <w:sz w:val="18"/>
         </w:rPr>
-        <w:t>Note. Decline_* = Pre − Post (positive = attrition; negative = gain). Kurtosis = excess kurtosis.</w:t>
+        <w:t>Note. Proficiency scores (Pre_*/Post_*) are on the institutional 0–100 scale; the Preparatory Year Programme pass threshold was 60/100 (≈ CEFR B1). Decline_* = Pre − Post in points on that scale (positive = attrition; negative = gain). Kurtosis = excess kurtosis.</w:t>
       </w:r>
     </w:p>
     <w:p>
@@ -3364,7 +3364,7 @@
           <w:i/>
           <w:sz w:val="18"/>
         </w:rPr>
-        <w:t>Note. Positive M change = attrition (lower at graduation); negative = gain. d_z = Cohen’s d for paired designs.</w:t>
+        <w:t>Note. Skill scores are out of 100. The PYP pass threshold was 60/100 (≈ CEFR B1); all completers scored ≥ 60 at pretest. Positive M change = attrition (lower at graduation); negative = gain. d_z = Cohen’s d for paired designs. Written skills (Reading, Writing) show no statistically significant decline and are summarised here rather than in a separate figure.</w:t>
       </w:r>
     </w:p>
     <w:p>
@@ -3380,7 +3380,7 @@
           <w:i/>
           <w:sz w:val="20"/>
         </w:rPr>
-        <w:t>Figure 1. Tableau-style overview of the pre–post panel and mechanism paths</w:t>
+        <w:t>Figure 1. Mean pre–post change by skill with 95% CI (points on the 0–100 institutional scale; PYP pass threshold = 60)</w:t>
       </w:r>
     </w:p>
     <w:p>
@@ -3390,7 +3390,7 @@
       <w:r>
         <w:drawing>
           <wp:inline xmlns:a="http://schemas.openxmlformats.org/drawingml/2006/main" xmlns:pic="http://schemas.openxmlformats.org/drawingml/2006/picture">
-            <wp:extent cx="5760720" cy="3655078"/>
+            <wp:extent cx="5486400" cy="3526971"/>
             <wp:docPr id="1" name="Picture 1"/>
             <wp:cNvGraphicFramePr>
               <a:graphicFrameLocks noChangeAspect="1"/>
@@ -3399,7 +3399,7 @@
               <a:graphicData uri="http://schemas.openxmlformats.org/drawingml/2006/picture">
                 <pic:pic>
                   <pic:nvPicPr>
-                    <pic:cNvPr id="0" name="tableau_dashboard_overview.png"/>
+                    <pic:cNvPr id="0" name="fig1_skill_mean_decline.png"/>
                     <pic:cNvPicPr/>
                   </pic:nvPicPr>
                   <pic:blipFill>
@@ -3411,7 +3411,7 @@
                   <pic:spPr>
                     <a:xfrm>
                       <a:off x="0" y="0"/>
-                      <a:ext cx="5760720" cy="3655078"/>
+                      <a:ext cx="5486400" cy="3526971"/>
                     </a:xfrm>
                     <a:prstGeom prst="rect"/>
                   </pic:spPr>
@@ -3420,6 +3420,21 @@
             </a:graphic>
           </wp:inline>
         </w:drawing>
+      </w:r>
+    </w:p>
+    <w:p>
+      <w:pPr>
+        <w:spacing w:after="200" w:line="360" w:lineRule="auto"/>
+        <w:jc w:val="both"/>
+      </w:pPr>
+      <w:r>
+        <w:rPr>
+          <w:rFonts w:ascii="Times New Roman" w:hAnsi="Times New Roman" w:eastAsia="Times New Roman"/>
+          <w:b w:val="0"/>
+          <w:i/>
+          <w:sz w:val="18"/>
+        </w:rPr>
+        <w:t>Note. Positive values indicate attrition. Listening and Speaking (oral–aural) decline significantly; Reading and Writing do not.</w:t>
       </w:r>
     </w:p>
     <w:p>
@@ -3435,7 +3450,7 @@
           <w:i/>
           <w:sz w:val="20"/>
         </w:rPr>
-        <w:t>Figure 2. Speaking decline associated with underrating and translanguaging exposure</w:t>
+        <w:t>Figure 2. Speaking decline associated with lecturer underrating and translanguaging exposure (Speaking change in points on the 0–100 scale)</w:t>
       </w:r>
     </w:p>
     <w:p>
@@ -3445,7 +3460,7 @@
       <w:r>
         <w:drawing>
           <wp:inline xmlns:a="http://schemas.openxmlformats.org/drawingml/2006/main" xmlns:pic="http://schemas.openxmlformats.org/drawingml/2006/picture">
-            <wp:extent cx="5760720" cy="2743200"/>
+            <wp:extent cx="5669280" cy="2807643"/>
             <wp:docPr id="2" name="Picture 2"/>
             <wp:cNvGraphicFramePr>
               <a:graphicFrameLocks noChangeAspect="1"/>
@@ -3454,7 +3469,7 @@
               <a:graphicData uri="http://schemas.openxmlformats.org/drawingml/2006/picture">
                 <pic:pic>
                   <pic:nvPicPr>
-                    <pic:cNvPr id="0" name="rstudio_golem_paths.png"/>
+                    <pic:cNvPr id="0" name="fig2_golem_speaking_paths.png"/>
                     <pic:cNvPicPr/>
                   </pic:nvPicPr>
                   <pic:blipFill>
@@ -3466,7 +3481,7 @@
                   <pic:spPr>
                     <a:xfrm>
                       <a:off x="0" y="0"/>
-                      <a:ext cx="5760720" cy="2743200"/>
+                      <a:ext cx="5669280" cy="2807643"/>
                     </a:xfrm>
                     <a:prstGeom prst="rect"/>
                   </pic:spPr>
@@ -3475,6 +3490,21 @@
             </a:graphic>
           </wp:inline>
         </w:drawing>
+      </w:r>
+    </w:p>
+    <w:p>
+      <w:pPr>
+        <w:spacing w:after="240" w:line="360" w:lineRule="auto"/>
+        <w:jc w:val="both"/>
+      </w:pPr>
+      <w:r>
+        <w:rPr>
+          <w:rFonts w:ascii="Times New Roman" w:hAnsi="Times New Roman" w:eastAsia="Times New Roman"/>
+          <w:b w:val="0"/>
+          <w:i/>
+          <w:sz w:val="18"/>
+        </w:rPr>
+        <w:t>Note. Other associations (reliability, concurrent validity, OLS coefficients, mediation) are reported in Tables 1–4 rather than as additional figures.</w:t>
       </w:r>
     </w:p>
     <w:p>
@@ -4118,16 +4148,17 @@
     </w:tbl>
     <w:p>
       <w:pPr>
-        <w:spacing w:after="120" w:line="360" w:lineRule="auto"/>
+        <w:spacing w:after="240" w:line="360" w:lineRule="auto"/>
         <w:jc w:val="both"/>
       </w:pPr>
       <w:r>
         <w:rPr>
           <w:rFonts w:ascii="Times New Roman" w:hAnsi="Times New Roman" w:eastAsia="Times New Roman"/>
           <w:b w:val="0"/>
-          <w:i w:val="0"/>
-          <w:sz w:val="22"/>
+          <w:i/>
+          <w:sz w:val="18"/>
         </w:rPr>
+        <w:t>Note. Underrating_Gap is in points on the same 0–100 institutional scale (actual Pre_Overall − lecturer estimate). Decline_Speaking is likewise in points on 0–100.</w:t>
       </w:r>
     </w:p>
     <w:p>
@@ -4786,7 +4817,7 @@
           <w:i/>
           <w:sz w:val="18"/>
         </w:rPr>
-        <w:t>Note. Models also included Pre_Speaking, major, and gender. Full tables are in the Excel workbook (Regression_models).</w:t>
+        <w:t>Note. Models also included Pre_Speaking, major, and gender. Coefficients for Underrating_Gap and Decline_Speaking are in points on the 0–100 institutional scale (PYP pass threshold = 60). Full tables are in the Excel workbook (Regression_models).</w:t>
       </w:r>
     </w:p>
     <w:p>

</xml_diff>

<commit_message>
Replace Fig 1 signed bars with explicit Pre vs Post charts
Signed-difference bars were misread as gains when Listening/Speaking were
above zero. Publication Fig 1 is now grouped Pre/Post means with 95% CIs
and direction labels; Tableau dumbbell + CSV and RStudio ggplot2 scripts
are included as companions.

Co-authored-by: MehmetDEU <MehmetDEU@users.noreply.github.com>
</commit_message>
<xml_diff>
--- a/emi-proficiency-study/EMI_Methodology_and_Quantitative_Results.docx
+++ b/emi-proficiency-study/EMI_Methodology_and_Quantitative_Results.docx
@@ -4376,7 +4376,7 @@
           <w:i/>
           <w:sz w:val="20"/>
         </w:rPr>
-        <w:t>Mean pre–post change by skill with 95% confidence intervals (points on the 0–100 institutional scale).</w:t>
+        <w:t>Mean Pre (PYP exit) and Post (graduation) scores by skill with 95% confidence intervals of the mean (points on the 0–100 institutional scale). Listening and Speaking decline; Reading and Writing do not decline significantly. PYP pass threshold = 60.</w:t>
       </w:r>
     </w:p>
     <w:p>
@@ -4410,7 +4410,7 @@
       <w:r>
         <w:drawing>
           <wp:inline xmlns:a="http://schemas.openxmlformats.org/drawingml/2006/main" xmlns:pic="http://schemas.openxmlformats.org/drawingml/2006/picture">
-            <wp:extent cx="5394960" cy="3468189"/>
+            <wp:extent cx="5394960" cy="3401170"/>
             <wp:docPr id="1" name="Picture 1"/>
             <wp:cNvGraphicFramePr>
               <a:graphicFrameLocks noChangeAspect="1"/>
@@ -4431,7 +4431,7 @@
                   <pic:spPr>
                     <a:xfrm>
                       <a:off x="0" y="0"/>
-                      <a:ext cx="5394960" cy="3468189"/>
+                      <a:ext cx="5394960" cy="3401170"/>
                     </a:xfrm>
                     <a:prstGeom prst="rect"/>
                   </pic:spPr>

</xml_diff>

<commit_message>
Expand Fig 2 scatters to Listening + Speaking (RStudio)
Manuscript Fig 2 is now a 2×2 oral–aural path plot; add an all-skills
RStudio companion showing Reading/Writing associations are flat.

Co-authored-by: MehmetDEU <MehmetDEU@users.noreply.github.com>
</commit_message>
<xml_diff>
--- a/emi-proficiency-study/EMI_Methodology_and_Quantitative_Results.docx
+++ b/emi-proficiency-study/EMI_Methodology_and_Quantitative_Results.docx
@@ -4400,7 +4400,7 @@
           <w:i w:val="0"/>
           <w:sz w:val="18"/>
         </w:rPr>
-        <w:t>Positive values indicate attrition. Listening and Speaking (oral–aural) decline significantly; Reading and Writing do not. PYP pass threshold = 60. Error bars are 95% CIs for mean differences (Nicol &amp; Pexman, 2010b).</w:t>
+        <w:t>Grouped Pre vs Post bars (ggplot2 / RStudio). Listening and Speaking (oral–aural) decline significantly; Reading and Writing do not. PYP pass threshold = 60. Error bars are 95% CIs of the mean (Nicol &amp; Pexman, 2010b).</w:t>
       </w:r>
     </w:p>
     <w:p>
@@ -4410,7 +4410,7 @@
       <w:r>
         <w:drawing>
           <wp:inline xmlns:a="http://schemas.openxmlformats.org/drawingml/2006/main" xmlns:pic="http://schemas.openxmlformats.org/drawingml/2006/picture">
-            <wp:extent cx="5394960" cy="3401170"/>
+            <wp:extent cx="5394960" cy="3371850"/>
             <wp:docPr id="1" name="Picture 1"/>
             <wp:cNvGraphicFramePr>
               <a:graphicFrameLocks noChangeAspect="1"/>
@@ -4419,7 +4419,7 @@
               <a:graphicData uri="http://schemas.openxmlformats.org/drawingml/2006/picture">
                 <pic:pic>
                   <pic:nvPicPr>
-                    <pic:cNvPr id="0" name="fig1_skill_mean_decline.png"/>
+                    <pic:cNvPr id="0" name="fig1_skill_prepost_ggplot.png"/>
                     <pic:cNvPicPr/>
                   </pic:nvPicPr>
                   <pic:blipFill>
@@ -4431,7 +4431,7 @@
                   <pic:spPr>
                     <a:xfrm>
                       <a:off x="0" y="0"/>
-                      <a:ext cx="5394960" cy="3401170"/>
+                      <a:ext cx="5394960" cy="3371850"/>
                     </a:xfrm>
                     <a:prstGeom prst="rect"/>
                   </pic:spPr>
@@ -5650,7 +5650,7 @@
           <w:i/>
           <w:sz w:val="20"/>
         </w:rPr>
-        <w:t>Speaking decline associated with lecturer underrating (A) and translanguaging exposure (B).</w:t>
+        <w:t>Oral–aural attrition paths: Listening (A–B) and Speaking (C–D) decline associated with lecturer underrating and translanguaging exposure.</w:t>
       </w:r>
     </w:p>
     <w:p>
@@ -5674,7 +5674,7 @@
           <w:i w:val="0"/>
           <w:sz w:val="18"/>
         </w:rPr>
-        <w:t>Speaking change is in points on the 0–100 scale (pre − post). Fitted lines are OLS with 95% confidence bands. Multipanel layout follows Displaying Your Findings conventions for related scatterplots (Nicol &amp; Pexman, 2010b).</w:t>
+        <w:t>Decline is in points on the 0–100 scale (pre − post; positive = attrition). Fitted lines are OLS with 95% confidence bands. Reading and Writing show near-zero associations (supplementary all-skills panel). Multipanel layout follows Displaying Your Findings conventions for related scatterplots (Nicol &amp; Pexman, 2010b).</w:t>
       </w:r>
     </w:p>
     <w:p>
@@ -5684,7 +5684,7 @@
       <w:r>
         <w:drawing>
           <wp:inline xmlns:a="http://schemas.openxmlformats.org/drawingml/2006/main" xmlns:pic="http://schemas.openxmlformats.org/drawingml/2006/picture">
-            <wp:extent cx="5577840" cy="2762359"/>
+            <wp:extent cx="5669280" cy="4301537"/>
             <wp:docPr id="2" name="Picture 2"/>
             <wp:cNvGraphicFramePr>
               <a:graphicFrameLocks noChangeAspect="1"/>
@@ -5693,7 +5693,7 @@
               <a:graphicData uri="http://schemas.openxmlformats.org/drawingml/2006/picture">
                 <pic:pic>
                   <pic:nvPicPr>
-                    <pic:cNvPr id="0" name="fig2_golem_speaking_paths.png"/>
+                    <pic:cNvPr id="0" name="fig2_golem_paths_ggplot.png"/>
                     <pic:cNvPicPr/>
                   </pic:nvPicPr>
                   <pic:blipFill>
@@ -5705,7 +5705,7 @@
                   <pic:spPr>
                     <a:xfrm>
                       <a:off x="0" y="0"/>
-                      <a:ext cx="5577840" cy="2762359"/>
+                      <a:ext cx="5669280" cy="4301537"/>
                     </a:xfrm>
                     <a:prstGeom prst="rect"/>
                   </pic:spPr>

</xml_diff>

<commit_message>
docs: write QUANT Results with Nicol Play-It-Safe tables
Expand Methods rationale and Results paragraphs for Tables 1–2 and
Figure 1; regenerate markdown, docx, and HTML manuscript previews.

Co-authored-by: MehmetDEU <MehmetDEU@users.noreply.github.com>
</commit_message>
<xml_diff>
--- a/emi-proficiency-study/EMI_Methodology_and_Quantitative_Results.docx
+++ b/emi-proficiency-study/EMI_Methodology_and_Quantitative_Results.docx
@@ -87,7 +87,7 @@
           <w:i w:val="0"/>
           <w:sz w:val="22"/>
         </w:rPr>
-        <w:t>RQ2 (Qualitative — lecturers). How do content lecturers describe whether and why they use translanguaging in EMI courses?</w:t>
+        <w:t>RQ2 (Qualitative — students; primary). To what do students attribute oral–aural attrition during EMI, and what themes emerge (including frequent translanguaging)?</w:t>
       </w:r>
     </w:p>
     <w:p>
@@ -101,7 +101,7 @@
           <w:i w:val="0"/>
           <w:sz w:val="22"/>
         </w:rPr>
-        <w:t>RQ3 (Qualitative — students). How do students experience EMI classroom language practices, and how do they relate those practices to changes in their English proficiency—especially Listening and Speaking?</w:t>
+        <w:t>RQ3 (Qualitative — lecturers; optional/light). Do lecturers report translanguaging, for what reasons, and how do they perceive students’ English?</w:t>
       </w:r>
     </w:p>
     <w:p>
@@ -236,7 +236,7 @@
           <w:i w:val="0"/>
           <w:sz w:val="22"/>
         </w:rPr>
-        <w:t>Analyses addressed RQ1 only: paired-samples t tests and Wilcoxon signed-rank companions for each skill and Overall, with Cohen’s d_z and 95% confidence intervals for mean differences (Nicol &amp; Pexman, 2010a). Shapiro–Wilk tests inspected difference-score distributions. Results are reported in Play-It-Safe tables and one Pre–Post figure (Nicol &amp; Pexman, 2010b). Explanatory accounts of attrition are reserved for the qualitative strand.</w:t>
+        <w:t>Analyses addressed RQ1 only. Because the question concerns skill-specific Pre–Post change, paired-samples t tests (with Wilcoxon signed-rank companions) were run for Listening, Reading, Writing, Speaking, and Overall, reporting Cohen’s d_z and 95% confidence intervals for mean differences (Nicol &amp; Pexman, 2010a, t-test Play-It-Safe format). Shapiro–Wilk tests inspected difference-score distributions. MANOVA and repeated-measures ANOVA were not adopted as lead analyses: a multivariate omnibus would still require univariate follow-ups and would expand the results section without clarifying which skills declined. For publishing economy, presentation is limited to two tables and one grouped Pre–Post bar figure with 95% CIs (Nicol &amp; Pexman, 2010b). Explanatory accounts of attrition are reserved for the qualitative strand.</w:t>
       </w:r>
     </w:p>
     <w:p>
@@ -286,6 +286,21 @@
     </w:p>
     <w:p>
       <w:pPr>
+        <w:pStyle w:val="Heading2"/>
+      </w:pPr>
+      <w:r>
+        <w:rPr>
+          <w:rFonts w:ascii="Times New Roman" w:hAnsi="Times New Roman"/>
+          <w:b/>
+          <w:i w:val="0"/>
+          <w:color w:val="1F4E79"/>
+          <w:sz w:val="24"/>
+        </w:rPr>
+        <w:t>Preliminary descriptives</w:t>
+      </w:r>
+    </w:p>
+    <w:p>
+      <w:pPr>
         <w:spacing w:after="160" w:line="360" w:lineRule="auto"/>
         <w:ind w:firstLine="432"/>
       </w:pPr>
@@ -296,7 +311,7 @@
           <w:i w:val="0"/>
           <w:sz w:val="22"/>
         </w:rPr>
-        <w:t>All 120 completers scored at or above the institutional threshold at pretest (Pre_Overall minimum = 60.1). At graduation, 18 students (15.0%) scored below 60 overall. Table 1 reports Pre/Post descriptives; Table 2 reports paired tests; Figure 1 displays Pre vs Post means.</w:t>
+        <w:t>All 120 completers scored at or above the institutional threshold at pretest (Pre_Overall minimum = 60.1). Mean Overall declined from Pre (M = 66.79, SD = 4.61) to Post (M = 64.81, SD = 4.89). At graduation, 18 students (15.0%) scored below 60 overall. Table 1 reports Pre and Post means and standard deviations by skill in a Play-It-Safe means format (Nicol &amp; Pexman, 2010a).</w:t>
       </w:r>
     </w:p>
     <w:p>
@@ -1028,6 +1043,36 @@
     </w:tbl>
     <w:p>
       <w:pPr>
+        <w:pStyle w:val="Heading2"/>
+      </w:pPr>
+      <w:r>
+        <w:rPr>
+          <w:rFonts w:ascii="Times New Roman" w:hAnsi="Times New Roman"/>
+          <w:b/>
+          <w:i w:val="0"/>
+          <w:color w:val="1F4E79"/>
+          <w:sz w:val="24"/>
+        </w:rPr>
+        <w:t>Paired-samples comparisons</w:t>
+      </w:r>
+    </w:p>
+    <w:p>
+      <w:pPr>
+        <w:spacing w:after="160" w:line="360" w:lineRule="auto"/>
+        <w:ind w:firstLine="432"/>
+      </w:pPr>
+      <w:r>
+        <w:rPr>
+          <w:rFonts w:ascii="Times New Roman" w:hAnsi="Times New Roman"/>
+          <w:b w:val="0"/>
+          <w:i w:val="0"/>
+          <w:sz w:val="22"/>
+        </w:rPr>
+        <w:t>Table 2 presents paired-samples t tests for Pre–Post change (Mdiff = Pre − Post; positive values indicate attrition), following Nicol and Pexman’s (2010a) Play-It-Safe multi-t-test layout. Speaking showed the largest significant decline (Mdiff = 5.10, t(119) = 12.21, p &lt; .001, d_z = 1.11, 95% CI [4.27, 5.93]). Listening also declined significantly, though less sharply (Mdiff = 3.55, t(119) = 9.46, p &lt; .001, d_z = 0.86, 95% CI [2.81, 4.29]). Reading (Mdiff = -0.41, t(119) = -1.26, p = .21, d_z = -0.11) and Writing (Mdiff = -0.35, t(119) = -0.93, p = .35, d_z = -0.09) did not decline; both showed small non-significant gains. Overall declined significantly (Mdiff = 1.97, t(119) = 8.50, p &lt; .001, d_z = 0.78), reflecting the oral–aural losses. Wilcoxon signed-rank tests supported the same significance decisions.</w:t>
+      </w:r>
+    </w:p>
+    <w:p>
+      <w:pPr>
         <w:spacing w:before="240" w:after="0"/>
       </w:pPr>
       <w:r>
@@ -1065,7 +1110,7 @@
           <w:i w:val="0"/>
           <w:sz w:val="18"/>
         </w:rPr>
-        <w:t>Note. Mdiff = Pre − Post (positive = attrition). d_z = Cohen’s d for paired designs. 95% CIs are for mean differences. *p &lt; .05. **p &lt; .01. ***p &lt; .001.</w:t>
+        <w:t>Note. Mdiff = Pre − Post (positive = attrition). d_z = Cohen’s d for paired designs. 95% CIs are for mean differences. Wilcoxon signed-rank p values were consistent with the paired t conclusions. *p &lt; .05. **p &lt; .01. ***p &lt; .001.</w:t>
       </w:r>
     </w:p>
     <w:tbl>
@@ -2021,6 +2066,21 @@
     </w:tbl>
     <w:p>
       <w:pPr>
+        <w:pStyle w:val="Heading2"/>
+      </w:pPr>
+      <w:r>
+        <w:rPr>
+          <w:rFonts w:ascii="Times New Roman" w:hAnsi="Times New Roman"/>
+          <w:b/>
+          <w:i w:val="0"/>
+          <w:color w:val="1F4E79"/>
+          <w:sz w:val="24"/>
+        </w:rPr>
+        <w:t>Summary for the mixed-methods sequence</w:t>
+      </w:r>
+    </w:p>
+    <w:p>
+      <w:pPr>
         <w:spacing w:after="160" w:line="360" w:lineRule="auto"/>
         <w:ind w:firstLine="432"/>
       </w:pPr>
@@ -2031,7 +2091,7 @@
           <w:i w:val="0"/>
           <w:sz w:val="22"/>
         </w:rPr>
-        <w:t>Listening declined significantly (Mdiff = 3.55, t(119) = 9.46, p &lt; .001, d_z = 0.86). Speaking declined significantly and most strongly (Mdiff = 5.10, t(119) = 12.21, p &lt; .001, d_z = 1.11). Reading (Mdiff = -0.41, p = .21) and Writing (Mdiff = -0.35, p = .35) did not decline significantly; both showed small non-significant gains. These oral–aural losses motivate the qualitative phase (RQ2–RQ3).</w:t>
+        <w:t>Taken together, quantitative attrition is concentrated in the oral–aural skills: Speaking shows the greatest loss and Listening a substantial secondary loss, whereas Reading and Writing remain statistically stable (slight non-significant gains), consistent with stronger reliance on written EAP discourse during the degree. Figure 1 displays Pre versus Post means with 95% confidence intervals and is the sole publication figure. These results answer RQ1 and motivate the qualitative strand (RQ2–RQ3) on translanguaging and related attributions, without additional quantitative mechanism models.</w:t>
       </w:r>
     </w:p>
     <w:p>
@@ -2059,7 +2119,7 @@
           <w:i/>
           <w:sz w:val="22"/>
         </w:rPr>
-        <w:t>Mean Pre (PYP exit) and Post (graduation) scores by skill with 95% confidence intervals of the mean (0–100 scale). Listening and Speaking decline; Reading and Writing do not. PYP pass threshold = 60.</w:t>
+        <w:t>Mean Pre (PYP exit) and Post (graduation) scores by skill with 95% confidence intervals of the mean (0–100 scale). Speaking shows the largest decline, then Listening; Reading and Writing do not decline. PYP pass threshold = 60.</w:t>
       </w:r>
     </w:p>
     <w:p>
@@ -2073,7 +2133,7 @@
           <w:i w:val="0"/>
           <w:sz w:val="18"/>
         </w:rPr>
-        <w:t>Note. Grouped bars (ggplot2 / RStudio). Error bars = 95% CIs of the mean (Nicol &amp; Pexman, 2010b).</w:t>
+        <w:t>Note. Grouped bar graph (Nicol &amp; Pexman, 2010b). Error bars = 95% CIs of the mean. Only figure retained for publishing economy.</w:t>
       </w:r>
     </w:p>
     <w:p>

</xml_diff>

<commit_message>
style: polish Figure 1 for calmer journal look
Try slate/copper bars, tighter axis, and lean Post−Pre labels with
APA stars. Keep the prior PNG under outputs/archive for easy revert.

Co-authored-by: MehmetDEU <MehmetDEU@users.noreply.github.com>
</commit_message>
<xml_diff>
--- a/emi-proficiency-study/EMI_Methodology_and_Quantitative_Results.docx
+++ b/emi-proficiency-study/EMI_Methodology_and_Quantitative_Results.docx
@@ -2143,7 +2143,7 @@
       <w:r>
         <w:drawing>
           <wp:inline xmlns:a="http://schemas.openxmlformats.org/drawingml/2006/main" xmlns:pic="http://schemas.openxmlformats.org/drawingml/2006/picture">
-            <wp:extent cx="5394960" cy="3371850"/>
+            <wp:extent cx="5394960" cy="3236976"/>
             <wp:docPr id="1" name="Picture 1"/>
             <wp:cNvGraphicFramePr>
               <a:graphicFrameLocks noChangeAspect="1"/>
@@ -2164,7 +2164,7 @@
                   <pic:spPr>
                     <a:xfrm>
                       <a:off x="0" y="0"/>
-                      <a:ext cx="5394960" cy="3371850"/>
+                      <a:ext cx="5394960" cy="3236976"/>
                     </a:xfrm>
                     <a:prstGeom prst="rect"/>
                   </pic:spPr>

</xml_diff>

<commit_message>
docs: save qualitative sequence for the EMI study
Lock the semi-structured follow-up, the two student accounts, and the
lecturer reply that will be read as a Golem effect, including the YDS
and YÖKDİL credential as context rather than as oral-aural evidence.

Co-authored-by: Cursor <cursoragent@cursor.com>
</commit_message>
<xml_diff>
--- a/emi-proficiency-study/EMI_Methodology_and_Quantitative_Results.docx
+++ b/emi-proficiency-study/EMI_Methodology_and_Quantitative_Results.docx
@@ -87,7 +87,7 @@
           <w:i w:val="0"/>
           <w:sz w:val="22"/>
         </w:rPr>
-        <w:t>RQ2 (Qualitative — students; primary). To what do students attribute oral–aural attrition during EMI, and what themes emerge (including frequent translanguaging)?</w:t>
+        <w:t>RQ2 (Qualitative — students). To what do students attribute their oral–aural attrition? Semi-structured follow-up, not a separate question: Why do you think lecturers use Turkish so often? Prepared in advance from the researcher’s observation over several years, and asked after the open answer.</w:t>
       </w:r>
     </w:p>
     <w:p>
@@ -101,7 +101,7 @@
           <w:i w:val="0"/>
           <w:sz w:val="22"/>
         </w:rPr>
-        <w:t>RQ3 (Qualitative — lecturers; optional/light). Do lecturers report translanguaging, for what reasons, and how do they perceive students’ English?</w:t>
+        <w:t>RQ3 (Qualitative — lecturers). When lecturers use L1, what do they say underlies that use?</w:t>
       </w:r>
     </w:p>
     <w:p>
@@ -266,7 +266,22 @@
           <w:i w:val="0"/>
           <w:sz w:val="22"/>
         </w:rPr>
-        <w:t>RQ2–RQ3 will draw on lecturer and student interviews. Anticipated lecturer themes include translanguaging as compensation for perceived student English limitations to secure content learning. Anticipated student themes include materials/lecturer English beyond their level and/or lecturers’ limited EMI proficiency; reduced English verbal interaction; and a felt decline in Listening and Speaking. Thematic analysis will proceed after these quantitative results are fixed.</w:t>
+        <w:t>Phase 2 uses semi-structured interviews. Student interviews open with what oral–aural attrition is attributed to (RQ2), so other accounts, including reliance on written technical discourse, can surface without a prompt. Each student is then asked a prepared follow-up: why they think lecturers use Turkish so often. That question is not a second research question. It was written in advance because the researcher had observed frequent lecturer use of Turkish in these EMI classrooms over several years and expected it to be offered as an account of attrition. If the student has already mentioned Turkish, the follow-up probes that remark. If not, it is still asked and reported as a planned question.</w:t>
+      </w:r>
+    </w:p>
+    <w:p>
+      <w:pPr>
+        <w:spacing w:after="160" w:line="360" w:lineRule="auto"/>
+        <w:ind w:firstLine="432"/>
+      </w:pPr>
+      <w:r>
+        <w:rPr>
+          <w:rFonts w:ascii="Times New Roman" w:hAnsi="Times New Roman"/>
+          <w:b w:val="0"/>
+          <w:i w:val="0"/>
+          <w:sz w:val="22"/>
+        </w:rPr>
+        <w:t>The follow-up was prepared for two anticipated accounts. The first is lecturers’ limited English for sustained EMI teaching. The second is lecturers’ underrating of students’ English. Protecting subject content because Turkish is the shared first language is part of that second account, not a third theme. Lecturer interviews (RQ3) ask what underlies their own use of L1. From the same extended observation, lecturers are expected to cite only students’ low proficiency, not their own English. That answer is interpreted as a Golem effect. They are not expected to reflect on their own spoken English. When their proficiency is raised, the expected account is that they have already validated it by a proficiency test required for English-medium teaching. In this setting that credential is typically a national multiple-choice examination such as YDS or YÖKDİL: reading-based items on grammar, vocabulary, and the meaning of texts, with no Listening or Speaking component (ÖSYM). The test therefore does not evidence the oral–aural proficiency EMI teaching requires. Thematic analysis will proceed after these quantitative results are fixed.</w:t>
       </w:r>
     </w:p>
     <w:p>
@@ -311,7 +326,22 @@
           <w:i w:val="0"/>
           <w:sz w:val="22"/>
         </w:rPr>
-        <w:t>All 120 completers scored at or above the institutional threshold at pretest (Pre_Overall minimum = 60.1). Mean Overall declined from Pre (M = 66.79, SD = 4.61) to Post (M = 64.81, SD = 4.89). At graduation, 18 students (15.0%) scored below 60 overall. Table 1 reports Pre and Post means and standard deviations by skill in a Play-It-Safe means format (Nicol &amp; Pexman, 2010a).</w:t>
+        <w:t>All 120 completers met the institutional overall threshold at pretest (Pre_Overall minimum = 60.1). Skill scores were not uniformly above 60. Table 1 reports Pre and Post means and standard deviations in a Play-It-Safe means format (Nicol &amp; Pexman, 2010a). At PYP exit, skill means sat in a narrow band above the pass mark, from Speaking (M = 65.72, SD = 5.60) to Reading (M = 67.82, SD = 4.86). By graduation that band had split. Speaking fell to M = 60.62 (SD = 6.33), just above the threshold, and Listening to M = 63.70 (SD = 6.12). Reading (M = 68.23, SD = 5.72) and Writing (M = 66.69, SD = 6.51) were essentially unchanged. Post standard deviations were slightly larger than Pre standard deviations for every skill. Overall declined from M = 66.79 (SD = 4.61) to M = 64.81 (SD = 4.89).</w:t>
+      </w:r>
+    </w:p>
+    <w:p>
+      <w:pPr>
+        <w:spacing w:after="160" w:line="360" w:lineRule="auto"/>
+        <w:ind w:firstLine="432"/>
+      </w:pPr>
+      <w:r>
+        <w:rPr>
+          <w:rFonts w:ascii="Times New Roman" w:hAnsi="Times New Roman"/>
+          <w:b w:val="0"/>
+          <w:i w:val="0"/>
+          <w:sz w:val="22"/>
+        </w:rPr>
+        <w:t>The pass mark makes the practical size of that change clearer than the two-point overall mean. No student scored below 60 overall at pretest; 18 students (15.0%) did so at graduation. Below-threshold counts rose most for Speaking (20 of 120, 16.7%, to 56 of 120, 46.7%) and Listening (7 of 120, 5.8%, to 37 of 120, 30.8%). Reading (5 to 6) and Writing (10 to 16) changed little.</w:t>
       </w:r>
     </w:p>
     <w:p>
@@ -1053,6 +1083,36 @@
           <w:color w:val="1F4E79"/>
           <w:sz w:val="24"/>
         </w:rPr>
+        <w:t>Difference-score checks</w:t>
+      </w:r>
+    </w:p>
+    <w:p>
+      <w:pPr>
+        <w:spacing w:after="160" w:line="360" w:lineRule="auto"/>
+        <w:ind w:firstLine="432"/>
+      </w:pPr>
+      <w:r>
+        <w:rPr>
+          <w:rFonts w:ascii="Times New Roman" w:hAnsi="Times New Roman"/>
+          <w:b w:val="0"/>
+          <w:i w:val="0"/>
+          <w:sz w:val="22"/>
+        </w:rPr>
+        <w:t>Shapiro–Wilk tests on the Pre−Post difference scores did not indicate departure from normality: Listening W = .989, p = .41; Reading W = .987, p = .29; Writing W = .992, p = .75; Speaking W = .988, p = .35; Overall W = .986, p = .23. Paired-samples t tests were therefore appropriate. Wilcoxon signed-rank companions agreed with every significance decision in Table 2.</w:t>
+      </w:r>
+    </w:p>
+    <w:p>
+      <w:pPr>
+        <w:pStyle w:val="Heading2"/>
+      </w:pPr>
+      <w:r>
+        <w:rPr>
+          <w:rFonts w:ascii="Times New Roman" w:hAnsi="Times New Roman"/>
+          <w:b/>
+          <w:i w:val="0"/>
+          <w:color w:val="1F4E79"/>
+          <w:sz w:val="24"/>
+        </w:rPr>
         <w:t>Paired-samples comparisons</w:t>
       </w:r>
     </w:p>
@@ -1068,7 +1128,22 @@
           <w:i w:val="0"/>
           <w:sz w:val="22"/>
         </w:rPr>
-        <w:t>Table 2 presents paired-samples t tests for Pre–Post change (Mdiff = Pre − Post; positive values indicate attrition), following Nicol and Pexman’s (2010a) Play-It-Safe multi-t-test layout. Speaking showed the largest significant decline (Mdiff = 5.10, t(119) = 12.21, p &lt; .001, d_z = 1.11, 95% CI [4.27, 5.93]). Listening also declined significantly, though less sharply (Mdiff = 3.55, t(119) = 9.46, p &lt; .001, d_z = 0.86, 95% CI [2.81, 4.29]). Reading (Mdiff = -0.41, t(119) = -1.26, p = .21, d_z = -0.11) and Writing (Mdiff = -0.35, t(119) = -0.93, p = .35, d_z = -0.09) did not decline; both showed small non-significant gains. Overall declined significantly (Mdiff = 1.97, t(119) = 8.50, p &lt; .001, d_z = 0.78), reflecting the oral–aural losses. Wilcoxon signed-rank tests supported the same significance decisions.</w:t>
+        <w:t>Table 2 presents paired-samples t tests for Pre–Post change (Mdiff = Pre − Post; positive values indicate attrition), following Nicol and Pexman’s (2010a) Play-It-Safe multi-t-test layout. Effect sizes are Cohen’s d_z (about .20 small, .50 medium, and .80 large). Speaking showed a large decline (Mdiff = 5.10, SDdiff = 4.57, t(119) = 12.21, p &lt; .001, d_z = 1.11, 95% CI [4.27, 5.93]). The interval excludes zero: a loss of roughly four to six points is plausible for the population mean. Listening also declined, with a large effect (Mdiff = 3.55, SDdiff = 4.11, t(119) = 9.46, p &lt; .001, d_z = 0.86, 95% CI [2.81, 4.29]). The Speaking interval lies almost entirely above the Listening interval, so the point estimates order Speaking above Listening. A formal test of that difference was not run; repeated-measures ANOVA was not the lead analysis.</w:t>
+      </w:r>
+    </w:p>
+    <w:p>
+      <w:pPr>
+        <w:spacing w:after="160" w:line="360" w:lineRule="auto"/>
+        <w:ind w:firstLine="432"/>
+      </w:pPr>
+      <w:r>
+        <w:rPr>
+          <w:rFonts w:ascii="Times New Roman" w:hAnsi="Times New Roman"/>
+          <w:b w:val="0"/>
+          <w:i w:val="0"/>
+          <w:sz w:val="22"/>
+        </w:rPr>
+        <w:t>Reading (Mdiff = -0.41, t(119) = -1.26, p = .21, d_z = -0.11, 95% CI [-1.04, 0.23]) and Writing (Mdiff = -0.35, t(119) = -0.93, p = .35, d_z = -0.09, 95% CI [-1.09, 0.39]) did not decline. Both intervals include zero, and both effects are negligible. The negative differences are small non-significant gains. Overall declined (Mdiff = 1.97, t(119) = 8.50, p &lt; .001, d_z = 0.78, 95% CI [1.51, 2.43]), a medium-to-large effect. Because Overall is the unweighted mean of the four skills, that drop is the net of the oral–aural losses and the stable written scores, not a uniform decline across the profile.</w:t>
       </w:r>
     </w:p>
     <w:p>
@@ -2091,7 +2166,7 @@
           <w:i w:val="0"/>
           <w:sz w:val="22"/>
         </w:rPr>
-        <w:t>Taken together, quantitative attrition is concentrated in the oral–aural skills: Speaking shows the greatest loss and Listening a substantial secondary loss, whereas Reading and Writing remain statistically stable (slight non-significant gains), consistent with stronger reliance on written EAP discourse during the degree. Figure 1 displays Pre versus Post means with 95% confidence intervals and is the sole publication figure. These results answer RQ1 and motivate the qualitative strand (RQ2–RQ3) on translanguaging and related attributions, without additional quantitative mechanism models.</w:t>
+        <w:t>Figure 1 shows the same split: Pre means sit together, and Post means fall for Speaking and Listening while Reading and Writing hold. Speaking’s post mean rests on the pass mark, and nearly half the panel scored below 60 on Speaking at graduation. RQ1 is therefore answered at the skill level. Attrition is oral–aural, largest for Speaking and substantial for Listening; Reading and Writing do not decline. The pattern is compatible with heavier use of written EAP discourse than of spoken English during the degree, but Phase 1 does not test that explanation. Student interviews open with what oral–aural attrition is attributed to (RQ2), then a prepared follow-up on why lecturers use Turkish so often. Lecturer interviews (RQ3) ask what underlies their own L1 use. Lecturers are expected to cite only students’ low proficiency, and that answer is tied to the Golem effect.</w:t>
       </w:r>
     </w:p>
     <w:p>
@@ -2119,7 +2194,7 @@
           <w:i/>
           <w:sz w:val="22"/>
         </w:rPr>
-        <w:t>Mean Pre (PYP exit) and Post (graduation) scores by skill with 95% confidence intervals of the mean (0–100 scale). Speaking shows the largest decline, then Listening; Reading and Writing do not decline. PYP pass threshold = 60.</w:t>
+        <w:t>Mean Pre (PYP exit) and Post (graduation) scores by skill with 95% confidence intervals of the mean (0–100 scale). Labels above the bars are Post minus Pre (negative = attrition). Speaking shows the largest decline, then Listening; Reading and Writing do not decline. PYP pass threshold = 60.</w:t>
       </w:r>
     </w:p>
     <w:p>

</xml_diff>